<commit_message>
Paper A: tighten cutoff, null, and event-correlation prose in both trees.
Correct the corresponding-author address and keep the collaborator copies in step with the manuscript.

Co-authored-by: Cursor <cursoragent@cursor.com>
</commit_message>
<xml_diff>
--- a/08_current/Paper Updated/3-Paper Paradigm/paper_A_JACT/Paper_A_collaborator.docx
+++ b/08_current/Paper Updated/3-Paper Paradigm/paper_A_JACT/Paper_A_collaborator.docx
@@ -2,7 +2,7 @@
 <file path=word/document.xml><?xml version="1.0" encoding="utf-8"?>
 <w:document xmlns:w="http://schemas.openxmlformats.org/wordprocessingml/2006/main" xmlns:m="http://schemas.openxmlformats.org/officeDocument/2006/math" xmlns:r="http://schemas.openxmlformats.org/officeDocument/2006/relationships" xmlns:o="urn:schemas-microsoft-com:office:office" xmlns:v="urn:schemas-microsoft-com:vml" xmlns:w10="urn:schemas-microsoft-com:office:word" xmlns:a="http://schemas.openxmlformats.org/drawingml/2006/main" xmlns:pic="http://schemas.openxmlformats.org/drawingml/2006/picture" xmlns:wp="http://schemas.openxmlformats.org/drawingml/2006/wordprocessingDrawing">
   <w:body>
-    <w:bookmarkStart w:id="50" w:name="X0e1a5f02c7fe17d306acc9ca9527512be607c26"/>
+    <w:bookmarkStart w:id="51" w:name="X0e1a5f02c7fe17d306acc9ca9527512be607c26"/>
     <w:p>
       <w:pPr>
         <w:pStyle w:val="Heading1"/>
@@ -93,17 +93,23 @@
         <w:t xml:space="preserve"> </w:t>
       </w:r>
       <w:r>
+        <w:t xml:space="preserve">arXiv preprint now; journal refinement for</w:t>
+      </w:r>
+      <w:r>
+        <w:t xml:space="preserve"> </w:t>
+      </w:r>
+      <w:r>
         <w:rPr>
           <w:i/>
           <w:iCs/>
         </w:rPr>
-        <w:t xml:space="preserve">Journal of Applied and Computational Topology</w:t>
-      </w:r>
-      <w:r>
-        <w:t xml:space="preserve"> </w:t>
-      </w:r>
-      <w:r>
-        <w:t xml:space="preserve">(JACT); arXiv preprint</w:t>
+        <w:t xml:space="preserve">Journal of Quantitative Analysis in Sports</w:t>
+      </w:r>
+      <w:r>
+        <w:t xml:space="preserve"> </w:t>
+      </w:r>
+      <w:r>
+        <w:t xml:space="preserve">(JQAS).</w:t>
       </w:r>
       <w:r>
         <w:br/>
@@ -119,7 +125,16 @@
         <w:t xml:space="preserve"> </w:t>
       </w:r>
       <w:r>
-        <w:t xml:space="preserve">Working manuscript. Not yet submitted.</w:t>
+        <w:t xml:space="preserve">Working manuscript in arXiv format (</w:t>
+      </w:r>
+      <w:r>
+        <w:rPr>
+          <w:rStyle w:val="VerbatimChar"/>
+        </w:rPr>
+        <w:t xml:space="preserve">arxiv.sty</w:t>
+      </w:r>
+      <w:r>
+        <w:t xml:space="preserve">). Not yet posted.</w:t>
       </w:r>
     </w:p>
     <w:p>
@@ -167,7 +182,19 @@
         <w:t xml:space="preserve"> </w:t>
       </w:r>
       <w:r>
-        <w:t xml:space="preserve">match this pass. Overleaf can take a one-shot upload of those files.</w:t>
+        <w:t xml:space="preserve">match this pass. Overleaf can take a one-shot upload of those files, plus</w:t>
+      </w:r>
+      <w:r>
+        <w:t xml:space="preserve"> </w:t>
+      </w:r>
+      <w:r>
+        <w:rPr>
+          <w:rStyle w:val="VerbatimChar"/>
+        </w:rPr>
+        <w:t xml:space="preserve">arxiv.sty</w:t>
+      </w:r>
+      <w:r>
+        <w:t xml:space="preserve">.</w:t>
       </w:r>
     </w:p>
     <w:p>
@@ -179,13 +206,13 @@
           <w:b/>
           <w:bCs/>
         </w:rPr>
-        <w:t xml:space="preserve">Citations</w:t>
-      </w:r>
-      <w:r>
-        <w:t xml:space="preserve"> </w:t>
-      </w:r>
-      <w:r>
-        <w:t xml:space="preserve">are author–year, matching the JACT manuscript (</w:t>
+        <w:t xml:space="preserve">Citations.</w:t>
+      </w:r>
+      <w:r>
+        <w:t xml:space="preserve"> </w:t>
+      </w:r>
+      <w:r>
+        <w:t xml:space="preserve">The Markdown review copy keeps author–year for readability. The compiled manuscript uses Vancouver numbers (</w:t>
       </w:r>
       <w:r>
         <w:rPr>
@@ -197,7 +224,28 @@
         <w:t xml:space="preserve"> </w:t>
       </w:r>
       <w:r>
-        <w:t xml:space="preserve">name–year). They are not Vancouver numbers.</w:t>
+        <w:rPr>
+          <w:rStyle w:val="VerbatimChar"/>
+        </w:rPr>
+        <w:t xml:space="preserve">numbers,sort&amp;compress</w:t>
+      </w:r>
+      <w:r>
+        <w:t xml:space="preserve"> </w:t>
+      </w:r>
+      <w:r>
+        <w:t xml:space="preserve">+</w:t>
+      </w:r>
+      <w:r>
+        <w:t xml:space="preserve"> </w:t>
+      </w:r>
+      <w:r>
+        <w:rPr>
+          <w:rStyle w:val="VerbatimChar"/>
+        </w:rPr>
+        <w:t xml:space="preserve">unsrtnat</w:t>
+      </w:r>
+      <w:r>
+        <w:t xml:space="preserve">), matching JQAS.</w:t>
       </w:r>
     </w:p>
     <w:p>
@@ -1158,6 +1206,101 @@
           <w:b/>
           <w:bCs/>
         </w:rPr>
+        <w:t xml:space="preserve">Shared wording (locked, abstract + §1).</w:t>
+      </w:r>
+      <w:r>
+        <w:t xml:space="preserve"> </w:t>
+      </w:r>
+      <w:r>
+        <w:t xml:space="preserve">Use these forms later, do not reinvent them. A level is named by how many groups it contains (cardinality). The cutoff</w:t>
+      </w:r>
+      <w:r>
+        <w:t xml:space="preserve"> </w:t>
+      </w:r>
+      <m:oMath>
+        <m:r>
+          <m:t>δ</m:t>
+        </m:r>
+      </m:oMath>
+      <w:r>
+        <w:t xml:space="preserve"> </w:t>
+      </w:r>
+      <w:r>
+        <w:t xml:space="preserve">is read from the</w:t>
+      </w:r>
+      <w:r>
+        <w:t xml:space="preserve"> </w:t>
+      </w:r>
+      <w:r>
+        <w:rPr>
+          <w:i/>
+          <w:iCs/>
+        </w:rPr>
+        <w:t xml:space="preserve">group-count curve</w:t>
+      </w:r>
+      <w:r>
+        <w:t xml:space="preserve">, not assumed from the class. Persistent homology records connected components (</w:t>
+      </w:r>
+      <m:oMath>
+        <m:sSub>
+          <m:e>
+            <m:r>
+              <m:t>H</m:t>
+            </m:r>
+          </m:e>
+          <m:sub>
+            <m:r>
+              <m:t>0</m:t>
+            </m:r>
+          </m:sub>
+        </m:sSub>
+      </m:oMath>
+      <w:r>
+        <w:t xml:space="preserve">) and loops (</w:t>
+      </w:r>
+      <m:oMath>
+        <m:sSub>
+          <m:e>
+            <m:r>
+              <m:t>H</m:t>
+            </m:r>
+          </m:e>
+          <m:sub>
+            <m:r>
+              <m:t>1</m:t>
+            </m:r>
+          </m:sub>
+        </m:sSub>
+      </m:oMath>
+      <w:r>
+        <w:t xml:space="preserve">) as a distance parameter grows. Bar</w:t>
+      </w:r>
+      <w:r>
+        <w:t xml:space="preserve"> </w:t>
+      </w:r>
+      <w:r>
+        <w:rPr>
+          <w:i/>
+          <w:iCs/>
+        </w:rPr>
+        <w:t xml:space="preserve">length</w:t>
+      </w:r>
+      <w:r>
+        <w:t xml:space="preserve"> </w:t>
+      </w:r>
+      <w:r>
+        <w:t xml:space="preserve">is a distance; it is not clock time. Metres appear only after positions are on a pitch.</w:t>
+      </w:r>
+    </w:p>
+    <w:p>
+      <w:pPr>
+        <w:pStyle w:val="BodyText"/>
+      </w:pPr>
+      <w:r>
+        <w:rPr>
+          <w:b/>
+          <w:bCs/>
+        </w:rPr>
         <w:t xml:space="preserve">Remainder of the paper (locked, from §1 revision).</w:t>
       </w:r>
       <w:r>
@@ -1412,10 +1555,7 @@
         <w:pStyle w:val="FirstParagraph"/>
       </w:pPr>
       <w:r>
-        <w:t xml:space="preserve">Standard single-parameter Vietoris–Rips persistent homology applied to a hierarchically organised point cloud mixes features from distinct organisational levels in one diagram. In a competitive collective system the hierarchy has named levels, so that mixing blocks scale attribution. The interaction lengths are not assumed in metres: the class names the organisational levels by cardinality, and a cutoff sweep reads the metres from the</w:t>
-      </w:r>
-      <w:r>
-        <w:t xml:space="preserve"> </w:t>
+        <w:t xml:space="preserve">Competitive collective systems, including sports teams contesting a pitch, organise at several named levels at once: individuals, small groups, and a system-wide envelope. Persistent homology records connected components (</w:t>
       </w:r>
       <m:oMath>
         <m:sSub>
@@ -1430,30 +1570,9 @@
             </m:r>
           </m:sub>
         </m:sSub>
-        <m:r>
-          <m:rPr>
-            <m:sty m:val="p"/>
-          </m:rPr>
-          <m:t>(</m:t>
-        </m:r>
-        <m:r>
-          <m:t>δ</m:t>
-        </m:r>
-        <m:r>
-          <m:rPr>
-            <m:sty m:val="p"/>
-          </m:rPr>
-          <m:t>)</m:t>
-        </m:r>
-      </m:oMath>
-      <w:r>
-        <w:t xml:space="preserve"> </w:t>
-      </w:r>
-      <w:r>
-        <w:t xml:space="preserve">curve. The paper then asks whether persistent homology can be made scale-attributable on a real, high-frequency, noisy point cloud. The point cloud is decomposed by hierarchical clustering at validated interaction lengths, and Vietoris–Rips homology is computed on the resulting centroids. Clustering changes the geometry, so a maximum filtration distance suited to one cutoff returns no</w:t>
-      </w:r>
-      <w:r>
-        <w:t xml:space="preserve"> </w:t>
+      </m:oMath>
+      <w:r>
+        <w:t xml:space="preserve">) and loops (</w:t>
       </w:r>
       <m:oMath>
         <m:sSub>
@@ -1470,10 +1589,23 @@
         </m:sSub>
       </m:oMath>
       <w:r>
-        <w:t xml:space="preserve"> </w:t>
-      </w:r>
-      <w:r>
-        <w:t xml:space="preserve">(loops) at another. Truncating the Vietoris–Rips parameter from the pairwise distances of the reduced cloud removes that obstruction. On ten professional football matches (broadcast tracking at 10 Hz), three stable</w:t>
+        <w:t xml:space="preserve">) as a distance parameter grows. On the full point cloud those levels mix in one diagram, so a change cannot be assigned to a level. This paper asks whether the homology can be made scale-attributable: each diagram belonging to one organisational level.</w:t>
+      </w:r>
+    </w:p>
+    <w:p>
+      <w:pPr>
+        <w:pStyle w:val="BodyText"/>
+      </w:pPr>
+      <w:r>
+        <w:t xml:space="preserve">Positions are recorded in metres on a standard football pitch. The levels are named by how many groups they contain, not by an assumed length. A cutoff sweep then recovers those distances from the group-count curve. Hierarchical clustering at those recovered lengths decomposes the cloud, and persistent homology is computed on the resulting centroids.</w:t>
+      </w:r>
+    </w:p>
+    <w:p>
+      <w:pPr>
+        <w:pStyle w:val="BodyText"/>
+      </w:pPr>
+      <w:r>
+        <w:t xml:space="preserve">On ten professional matches (broadcast tracking at 10 Hz), three</w:t>
       </w:r>
       <w:r>
         <w:t xml:space="preserve"> </w:t>
@@ -1496,30 +1628,7 @@
         <w:t xml:space="preserve"> </w:t>
       </w:r>
       <w:r>
-        <w:t xml:space="preserve">(connected-component) regimes appear: individual (2.75 m), tactical (11.75 m), and team (23.0 m). Two</w:t>
-      </w:r>
-      <w:r>
-        <w:t xml:space="preserve"> </w:t>
-      </w:r>
-      <m:oMath>
-        <m:sSub>
-          <m:e>
-            <m:r>
-              <m:t>H</m:t>
-            </m:r>
-          </m:e>
-          <m:sub>
-            <m:r>
-              <m:t>1</m:t>
-            </m:r>
-          </m:sub>
-        </m:sSub>
-      </m:oMath>
-      <w:r>
-        <w:t xml:space="preserve"> </w:t>
-      </w:r>
-      <w:r>
-        <w:t xml:space="preserve">regimes appear with them: individual-level loops are frequent (presence</w:t>
+        <w:t xml:space="preserve">regimes appear: individual (2.75 m), tactical (11.75 m), and team (23.0 m). Loops appear at the first two levels, not the third. Individual-level loops appear in</w:t>
       </w:r>
       <w:r>
         <w:t xml:space="preserve"> </w:t>
@@ -1548,7 +1657,7 @@
         <w:t xml:space="preserve"> </w:t>
       </w:r>
       <w:r>
-        <w:t xml:space="preserve">of frames across matches) with short filtration lifetime; tactical-level loops are rarer (presence</w:t>
+        <w:t xml:space="preserve">of frames (short bar length in metres); tactical-level loops appear in</w:t>
       </w:r>
       <w:r>
         <w:t xml:space="preserve"> </w:t>
@@ -1574,173 +1683,10 @@
         </m:r>
       </m:oMath>
       <w:r>
-        <w:t xml:space="preserve">) with longer filtration lifetime (primary-match mean</w:t>
-      </w:r>
-      <w:r>
-        <w:t xml:space="preserve"> </w:t>
-      </w:r>
-      <m:oMath>
-        <m:r>
-          <m:t>p</m:t>
-        </m:r>
-        <m:r>
-          <m:rPr>
-            <m:sty m:val="p"/>
-          </m:rPr>
-          <m:t>=</m:t>
-        </m:r>
-        <m:r>
-          <m:t>3.778</m:t>
-        </m:r>
-      </m:oMath>
-      <w:r>
-        <w:t xml:space="preserve"> </w:t>
-      </w:r>
-      <w:r>
-        <w:t xml:space="preserve">m versus</w:t>
-      </w:r>
-      <w:r>
-        <w:t xml:space="preserve"> </w:t>
-      </w:r>
-      <m:oMath>
-        <m:r>
-          <m:t>1.931</m:t>
-        </m:r>
-      </m:oMath>
-      <w:r>
-        <w:t xml:space="preserve"> </w:t>
-      </w:r>
-      <w:r>
-        <w:t xml:space="preserve">m where loops appear); team-level</w:t>
-      </w:r>
-      <w:r>
-        <w:t xml:space="preserve"> </w:t>
-      </w:r>
-      <m:oMath>
-        <m:sSub>
-          <m:e>
-            <m:r>
-              <m:t>H</m:t>
-            </m:r>
-          </m:e>
-          <m:sub>
-            <m:r>
-              <m:t>1</m:t>
-            </m:r>
-          </m:sub>
-        </m:sSub>
-      </m:oMath>
-      <w:r>
-        <w:t xml:space="preserve"> </w:t>
-      </w:r>
-      <w:r>
-        <w:t xml:space="preserve">is absent on the sampled frames (most complete frames at</w:t>
-      </w:r>
-      <w:r>
-        <w:t xml:space="preserve"> </w:t>
-      </w:r>
-      <m:oMath>
-        <m:r>
-          <m:t>23.0</m:t>
-        </m:r>
-      </m:oMath>
-      <w:r>
-        <w:t xml:space="preserve"> </w:t>
-      </w:r>
-      <w:r>
-        <w:t xml:space="preserve">m have</w:t>
-      </w:r>
-      <w:r>
-        <w:t xml:space="preserve"> </w:t>
-      </w:r>
-      <m:oMath>
-        <m:r>
-          <m:t>k</m:t>
-        </m:r>
-        <m:r>
-          <m:rPr>
-            <m:sty m:val="p"/>
-          </m:rPr>
-          <m:t>≤</m:t>
-        </m:r>
-        <m:r>
-          <m:t>2</m:t>
-        </m:r>
-      </m:oMath>
-      <w:r>
-        <w:t xml:space="preserve"> </w:t>
-      </w:r>
-      <w:r>
-        <w:t xml:space="preserve">centroids). Geometric cycle representatives are recovered for every</w:t>
-      </w:r>
-      <w:r>
-        <w:t xml:space="preserve"> </w:t>
-      </w:r>
-      <m:oMath>
-        <m:sSub>
-          <m:e>
-            <m:r>
-              <m:t>H</m:t>
-            </m:r>
-          </m:e>
-          <m:sub>
-            <m:r>
-              <m:t>1</m:t>
-            </m:r>
-          </m:sub>
-        </m:sSub>
-      </m:oMath>
-      <w:r>
-        <w:t xml:space="preserve"> </w:t>
-      </w:r>
-      <w:r>
-        <w:t xml:space="preserve">feature examined. These regime counts hold across matches and across wide ranges of both the cutoff and the truncation percentile. The two</w:t>
-      </w:r>
-      <w:r>
-        <w:t xml:space="preserve"> </w:t>
-      </w:r>
-      <m:oMath>
-        <m:sSub>
-          <m:e>
-            <m:r>
-              <m:t>H</m:t>
-            </m:r>
-          </m:e>
-          <m:sub>
-            <m:r>
-              <m:t>1</m:t>
-            </m:r>
-          </m:sub>
-        </m:sSub>
-      </m:oMath>
-      <w:r>
-        <w:t xml:space="preserve"> </w:t>
-      </w:r>
-      <w:r>
-        <w:t xml:space="preserve">levels carry distinct rather than redundant information (Spearman</w:t>
-      </w:r>
-      <w:r>
-        <w:t xml:space="preserve"> </w:t>
-      </w:r>
-      <m:oMath>
-        <m:r>
-          <m:t>ρ</m:t>
-        </m:r>
-        <m:r>
-          <m:rPr>
-            <m:sty m:val="p"/>
-          </m:rPr>
-          <m:t>=</m:t>
-        </m:r>
-        <m:r>
-          <m:t>0.234</m:t>
-        </m:r>
-      </m:oMath>
-      <w:r>
-        <w:t xml:space="preserve"> </w:t>
-      </w:r>
-      <w:r>
-        <w:t xml:space="preserve">across 1,500 sampled frames). Football supplies the measurement setting; the same pipeline applies to other bounded competitive systems once interaction lengths are re-derived.</w:t>
+        <w:t xml:space="preserve"> </w:t>
+      </w:r>
+      <w:r>
+        <w:t xml:space="preserve">(longer bar length). Every examined loop is realised in space, and the two levels carry distinct information. The same pipeline applies to other bounded competitive systems once interaction lengths are re-derived.</w:t>
       </w:r>
     </w:p>
     <w:p>
@@ -1758,7 +1704,7 @@
         <w:t xml:space="preserve"> </w:t>
       </w:r>
       <w:r>
-        <w:t xml:space="preserve">persistent homology, multi-scale topology, Vietoris–Rips filtration, multi-agent systems, spatial tracking data, sports analytics</w:t>
+        <w:t xml:space="preserve">Vietoris–Rips filtration, topological data analysis, spatial tracking, hierarchical clustering, team sports</w:t>
       </w:r>
     </w:p>
     <w:p>
@@ -1792,7 +1738,7 @@
         <w:pStyle w:val="FirstParagraph"/>
       </w:pPr>
       <w:r>
-        <w:t xml:space="preserve">Collective systems of agents in space are typically hierarchically organised. Starling murmurations, fish shoals, and insect swarms, for example, show individuals, local groups, and a system-wide envelope occupying distinct spatial scales at once (Sumpter, 2006). Understanding how those scales interact is a standing challenge in applied mathematics, and one that high-frequency spatial tracking data is increasingly able to inform (Herbert-Read et al., 2011).</w:t>
+        <w:t xml:space="preserve">Collective systems of agents in space are typically hierarchically organised. Starling murmurations, fish shoals, and insect swarms, for example, show individuals, local groups, and a system-wide envelope at once (Sumpter, 2006). Understanding how those organisational levels interact is a standing challenge in applied mathematics, and one that high-frequency spatial tracking data is increasingly able to inform (Herbert-Read et al., 2011).</w:t>
       </w:r>
     </w:p>
     <w:p>
@@ -1808,7 +1754,7 @@
         <w:pStyle w:val="BodyText"/>
       </w:pPr>
       <w:r>
-        <w:t xml:space="preserve">Agents in such systems can arrange themselves in ring-like formations that enclose empty space: milling in a fish school, a vortex in a swarm, or, in the competitive subset, encirclement of an opponent. These arrangements are important to identify because enclosure is a distinct mode of organisation, not a change in density or alignment: a loop holds a region of space, whether that region is an empty core or the space denied to an opponent. How long a loop survives in a filtration distinguishes a stable enclosure from a fleeting coincidence of positions. Conventional geometric summaries, including convex-hull area, nearest-neighbour distance, and polarisation, capture dispersion and alignment (Sumpter, 2006) but do not directly quantify this loop structure.</w:t>
+        <w:t xml:space="preserve">Agents in such systems can arrange themselves in ring-like formations that enclose empty space: milling in a fish school, a vortex in a swarm, or, in the competitive subset, encirclement of an opponent. These arrangements are important to identify because enclosure is a distinct mode of organisation, not a change in density or alignment. A loop holds a region of space, whether that region is an empty core or the space denied to an opponent. Conventional geometric summaries, including convex-hull area, nearest-neighbour distance, and polarisation, capture dispersion and alignment (Sumpter, 2006) but do not directly quantify this loop structure.</w:t>
       </w:r>
     </w:p>
     <w:p>
@@ -1816,7 +1762,41 @@
         <w:pStyle w:val="BodyText"/>
       </w:pPr>
       <w:r>
-        <w:t xml:space="preserve">Persistent homology, a central tool of topological data analysis (TDA), provides a principled way to detect and measure such formations across a continuum of scales (Edelsbrunner et al., 2002; Edelsbrunner and Harer, 2010; Carlsson, 2009; Munch, 2017; Chazal and Michel, 2021). A filtration of simplicial complexes indexed by a scale parameter tracks the birth and death of topological features. Each feature is recorded as a bar: the interval from the scale at which it appears (birth) to the scale at which it disappears (death) (Ghrist, 2008). The collection of bars is the persistence diagram (Cohen-Steiner et al., 2007). Efficient computation via the Vietoris–Rips filtration is due to Bauer (2021); persistence landscapes provide a functional representation for later statistical analysis (Bubenik, 2015).</w:t>
+        <w:t xml:space="preserve">Persistent homology, a central tool of topological data analysis (TDA), records connected components (</w:t>
+      </w:r>
+      <m:oMath>
+        <m:sSub>
+          <m:e>
+            <m:r>
+              <m:t>H</m:t>
+            </m:r>
+          </m:e>
+          <m:sub>
+            <m:r>
+              <m:t>0</m:t>
+            </m:r>
+          </m:sub>
+        </m:sSub>
+      </m:oMath>
+      <w:r>
+        <w:t xml:space="preserve">) and loops (</w:t>
+      </w:r>
+      <m:oMath>
+        <m:sSub>
+          <m:e>
+            <m:r>
+              <m:t>H</m:t>
+            </m:r>
+          </m:e>
+          <m:sub>
+            <m:r>
+              <m:t>1</m:t>
+            </m:r>
+          </m:sub>
+        </m:sSub>
+      </m:oMath>
+      <w:r>
+        <w:t xml:space="preserve">) as a distance parameter grows (Edelsbrunner et al., 2002; Edelsbrunner and Harer, 2010; Carlsson, 2009; Munch, 2017; Chazal and Michel, 2021). A filtration of simplicial complexes indexed by that parameter tracks the birth and death of those features. Each feature is recorded as a bar: the interval from the distance at which it appears (birth) to the distance at which it disappears (death) (Ghrist, 2008). The length of the bar distinguishes a stable enclosure from a fleeting coincidence of positions. The collection of bars is the persistence diagram (Cohen-Steiner et al., 2007). Efficient computation via the Vietoris–Rips filtration is due to Bauer (2021); persistence landscapes provide a functional representation for later statistical analysis (Bubenik, 2015).</w:t>
       </w:r>
     </w:p>
     <w:p>
@@ -1824,7 +1804,7 @@
         <w:pStyle w:val="BodyText"/>
       </w:pPr>
       <w:r>
-        <w:t xml:space="preserve">That representation has recovered cavities in protein atom clouds that mark flexibility and folding (Xia and Wei, 2014). It has identified medium-range order in amorphous solids that conventional crystallography does not resolve (Hiraoka et al., 2016). In biological aggregation models it has shown that distinct swarming organisations appear at different filtration values (Topaz et al., 2015). The same single-parameter construction, applied directly to a hierarchically organised multi-agent point cloud, raises the measurement difficulty treated in Section 1.2. This paper asks whether that homology can be made scale-attributable on a competitive collective system. Opposition couples successive positions (competitive dependence); that inference problem is not treated here.</w:t>
+        <w:t xml:space="preserve">Persistent homology has recovered cavities in protein atom clouds that mark flexibility and folding (Xia and Wei, 2014). It has identified medium-range order in amorphous solids that conventional crystallography does not resolve (Hiraoka et al., 2016). In biological aggregation models it has shown that distinct swarming organisations appear at different filtration values (Topaz et al., 2015). The same single-parameter construction, applied directly to a hierarchically organised multi-agent point cloud, raises the measurement difficulty treated in Section 1.2. This paper asks whether that homology can be made scale-attributable on a competitive collective system: each diagram belonging to one organisational level. Opposition couples successive positions (competitive dependence); that inference problem is not treated here.</w:t>
       </w:r>
     </w:p>
     <w:bookmarkEnd w:id="11"/>
@@ -1850,7 +1830,7 @@
         <w:pStyle w:val="BodyText"/>
       </w:pPr>
       <w:r>
-        <w:t xml:space="preserve">Applied studies make that mixing visible without removing it. Betti numbers from biological aggregation models, plotted against simulation time and filtration value, show that distinct swarming organisations appear at different filtration values (Topaz et al., 2015). That display remains one mixed summary. A parallel construction computes Vietoris–Rips features on multi-agent snapshots and yields a topological time series at a chosen scale (Gu et al., 2022). That series can detect change points; it does not decompose the cloud by organisational level.</w:t>
+        <w:t xml:space="preserve">Applied studies make that mixing visible without removing it. Component and loop counts (Betti numbers) from biological aggregation models, plotted against simulation time and filtration value, show that distinct swarming organisations appear at different filtration values (Topaz et al., 2015). That display remains one mixed summary. A parallel construction computes Vietoris–Rips features on multi-agent snapshots and yields a topological time series at a chosen scale (Gu et al., 2022). That series can detect change points; it does not decompose the cloud by organisational level.</w:t>
       </w:r>
     </w:p>
     <w:p>
@@ -1907,7 +1887,15 @@
         <w:pStyle w:val="FirstParagraph"/>
       </w:pPr>
       <w:r>
-        <w:t xml:space="preserve">Section 1.2 leaves a concrete question: whether persistent homology can be made scale-attributable on a competitive collective system. This paper answers that question by changing the input rather than slicing bars of one diagram. A cutoff distance</w:t>
+        <w:t xml:space="preserve">Section 1.2 leaves a concrete question: whether persistent homology can be made scale-attributable on a competitive collective system. This paper answers that question by changing the input rather than slicing bars of one diagram.</w:t>
+      </w:r>
+    </w:p>
+    <w:p>
+      <w:pPr>
+        <w:pStyle w:val="BodyText"/>
+      </w:pPr>
+      <w:r>
+        <w:t xml:space="preserve">A cutoff distance</w:t>
       </w:r>
       <w:r>
         <w:t xml:space="preserve"> </w:t>
@@ -1921,7 +1909,21 @@
         <w:t xml:space="preserve"> </w:t>
       </w:r>
       <w:r>
-        <w:t xml:space="preserve">groups nearby agents and replaces each group by its centroid, so the reduced cloud represents one organisational level named by cardinality; Vietoris–Rips homology is then computed on those centroids, with a maximum filtration distance taken from the reduced cloud itself and each</w:t>
+        <w:t xml:space="preserve">groups nearby agents and replaces each group by its centroid. The reduced cloud then represents one organisational level, named by how many groups it contains (its cardinality). The value of</w:t>
+      </w:r>
+      <w:r>
+        <w:t xml:space="preserve"> </w:t>
+      </w:r>
+      <m:oMath>
+        <m:r>
+          <m:t>δ</m:t>
+        </m:r>
+      </m:oMath>
+      <w:r>
+        <w:t xml:space="preserve"> </w:t>
+      </w:r>
+      <w:r>
+        <w:t xml:space="preserve">is not assumed from the class; it is read from the group-count curve (Section 2.3). Vietoris–Rips homology is then computed on those centroids. A maximum filtration distance is taken from the reduced cloud itself (Section 2.4). Each</w:t>
       </w:r>
       <w:r>
         <w:t xml:space="preserve"> </w:t>
@@ -1944,7 +1946,7 @@
         <w:t xml:space="preserve"> </w:t>
       </w:r>
       <w:r>
-        <w:t xml:space="preserve">bar realised as a closed loop in space (Sections 2.2–2.5). Neither clustering nor the truncation is algebraically new (Carlsson and Mémoli, 2010; Schindler and Barahona, 2023); the content is that the combination survives a real, high-frequency, noisy point cloud.</w:t>
+        <w:t xml:space="preserve">bar is realised as a closed loop in space (Section 2.5). Neither clustering nor the truncation is algebraically new (Carlsson and Mémoli, 2010; Schindler and Barahona, 2023); the content is that the combination remains effective on a real, high-frequency, noisy point cloud.</w:t>
       </w:r>
     </w:p>
     <w:p>
@@ -2019,7 +2021,7 @@
         <w:t xml:space="preserve"> </w:t>
       </w:r>
       <w:r>
-        <w:t xml:space="preserve">Can the organisational levels be recovered from the data rather than assumed in metres (Section 3.1)?</w:t>
+        <w:t xml:space="preserve">Can the organisational levels be recovered from the group-count curve rather than assumed as lengths in metres (Section 3.1)?</w:t>
       </w:r>
       <w:r>
         <w:t xml:space="preserve"> </w:t>
@@ -2098,7 +2100,7 @@
         <w:pStyle w:val="BodyText"/>
       </w:pPr>
       <w:r>
-        <w:t xml:space="preserve">Spatial analysis of team sport, including pitch-control models and network metrics on passing and collective structure, is surveyed by Gudmundsson and Horton (2017) and by Buldú et al. (2019) and Grund (2012); those methods complement the present pipeline but do not quantify two-dimensional enclosure through persistent homology. To our knowledge, no prior work combines cutoff-selected organisational levels with persistent homology for a competitive collective system, or validates the resulting regimes on high-frequency tracking across multiple independent recordings.</w:t>
+        <w:t xml:space="preserve">Spatial analysis of team sport is surveyed by Gudmundsson and Horton (2017) and by Buldú et al. (2019) and Grund (2012). Those methods include pitch-control models and network metrics on passing and collective structure. They complement the present pipeline but do not quantify two-dimensional enclosure through persistent homology. To our knowledge, no prior work combines cutoff-selected organisational levels with persistent homology for a competitive collective system, or recovers the resulting regimes on high-frequency tracking across multiple independent recordings.</w:t>
       </w:r>
     </w:p>
     <w:p>
@@ -2315,7 +2317,7 @@
         <w:pStyle w:val="BodyText"/>
       </w:pPr>
       <w:r>
-        <w:t xml:space="preserve">Consecutive complete frames share nearly the same configuration, so the full stream is not treated as a sequence of independent snapshots. Prevalence and organisational-level summaries are estimated on a uniform subsample instead. Write</w:t>
+        <w:t xml:space="preserve">Consecutive complete frames share nearly the same configuration, so the full stream is not treated as a sequence of independent snapshots. Connected-component and loop summaries are estimated on a uniform subsample instead. Write</w:t>
       </w:r>
       <w:r>
         <w:t xml:space="preserve"> </w:t>
@@ -2637,7 +2639,7 @@
         <w:pStyle w:val="FirstParagraph"/>
       </w:pPr>
       <w:r>
-        <w:t xml:space="preserve">On this corpus the named organisational levels of Section 1.2 (individual, small group, envelope) are instantiated as individual, tactical, and team. The class names those levels by cardinality. The cutoffs</w:t>
+        <w:t xml:space="preserve">On this corpus the named organisational levels of Section 1.2 (individual, small group, envelope) are instantiated as individual, tactical, and team. Each level is named by how many groups it contains. The cutoff</w:t>
       </w:r>
       <w:r>
         <w:t xml:space="preserve"> </w:t>
@@ -2651,7 +2653,7 @@
         <w:t xml:space="preserve"> </w:t>
       </w:r>
       <w:r>
-        <w:t xml:space="preserve">that select them are therefore read from the sweep in Section 2.3, rather than assumed in metres.</w:t>
+        <w:t xml:space="preserve">that selects it is read from the group-count curve in Section 2.3.</w:t>
       </w:r>
     </w:p>
     <w:p>
@@ -2991,7 +2993,7 @@
         <w:t xml:space="preserve"> </w:t>
       </w:r>
       <w:r>
-        <w:t xml:space="preserve">Vietoris–Rips (VR) on the cluster centroids</w:t>
+        <w:t xml:space="preserve">Vietoris–Rips on the cluster centroids</w:t>
       </w:r>
       <w:r>
         <w:t xml:space="preserve"> </w:t>
@@ -3661,7 +3663,7 @@
         <w:pStyle w:val="FirstParagraph"/>
       </w:pPr>
       <w:r>
-        <w:t xml:space="preserve">The class names the three organisational levels by cardinality. The selector therefore inverts a named cluster count rather than assuming a length in metres. The inversion is read from the pooled mean cluster-count curve on this corpus.</w:t>
+        <w:t xml:space="preserve">As the cutoff lengthens, nearby agents merge and the mean number of groups falls. Each organisational level takes its distance from the point on that curve where the group count named in Section 2.2 is reached.</w:t>
       </w:r>
     </w:p>
     <w:p>
@@ -3823,7 +3825,7 @@
         <w:t xml:space="preserve"> </w:t>
       </w:r>
       <w:r>
-        <w:t xml:space="preserve">be the mean cluster count at cutoff</w:t>
+        <w:t xml:space="preserve">denote that curve: the mean group count at cutoff</w:t>
       </w:r>
       <w:r>
         <w:t xml:space="preserve"> </w:t>
@@ -3881,7 +3883,7 @@
         <w:t xml:space="preserve"> </w:t>
       </w:r>
       <w:r>
-        <w:t xml:space="preserve">be the fraction of frames with at least four clusters. The three inversion rules are then as follows:</w:t>
+        <w:t xml:space="preserve">be the fraction of frames with at least four groups. The three inversion rules are then as follows:</w:t>
       </w:r>
     </w:p>
     <w:p>
@@ -4280,7 +4282,7 @@
         <w:t xml:space="preserve"> </w:t>
       </w:r>
       <w:r>
-        <w:t xml:space="preserve">still common, is a handful of coordinating groups that remain loop-feasible. The team target</w:t>
+        <w:t xml:space="preserve">still common, is a handful of coordinating groups, enough that a loop remains possible. The team target</w:t>
       </w:r>
       <w:r>
         <w:t xml:space="preserve"> </w:t>
@@ -4344,30 +4346,7 @@
         <w:t xml:space="preserve"> </w:t>
       </w:r>
       <w:r>
-        <w:t xml:space="preserve">m. Pooled mean</w:t>
-      </w:r>
-      <w:r>
-        <w:t xml:space="preserve"> </w:t>
-      </w:r>
-      <m:oMath>
-        <m:sSub>
-          <m:e>
-            <m:r>
-              <m:t>H</m:t>
-            </m:r>
-          </m:e>
-          <m:sub>
-            <m:r>
-              <m:t>0</m:t>
-            </m:r>
-          </m:sub>
-        </m:sSub>
-      </m:oMath>
-      <w:r>
-        <w:t xml:space="preserve"> </w:t>
-      </w:r>
-      <w:r>
-        <w:t xml:space="preserve">at those cutoffs is</w:t>
+        <w:t xml:space="preserve">m. Pooled mean group count at those cutoffs is</w:t>
       </w:r>
       <w:r>
         <w:t xml:space="preserve"> </w:t>
@@ -4487,150 +4466,6 @@
       </w:r>
       <w:r>
         <w:t xml:space="preserve">s.d. across matches). Acceptance requires every match’s mean</w:t>
-      </w:r>
-      <w:r>
-        <w:t xml:space="preserve"> </w:t>
-      </w:r>
-      <m:oMath>
-        <m:sSub>
-          <m:e>
-            <m:r>
-              <m:t>H</m:t>
-            </m:r>
-          </m:e>
-          <m:sub>
-            <m:r>
-              <m:t>0</m:t>
-            </m:r>
-          </m:sub>
-        </m:sSub>
-      </m:oMath>
-      <w:r>
-        <w:t xml:space="preserve"> </w:t>
-      </w:r>
-      <w:r>
-        <w:t xml:space="preserve">at the pooled cutoff to lie in</w:t>
-      </w:r>
-      <w:r>
-        <w:t xml:space="preserve"> </w:t>
-      </w:r>
-      <m:oMath>
-        <m:r>
-          <m:rPr>
-            <m:sty m:val="p"/>
-          </m:rPr>
-          <m:t>[</m:t>
-        </m:r>
-        <m:r>
-          <m:t>15</m:t>
-        </m:r>
-        <m:r>
-          <m:rPr>
-            <m:sty m:val="p"/>
-          </m:rPr>
-          <m:t>,</m:t>
-        </m:r>
-        <m:r>
-          <m:t>22</m:t>
-        </m:r>
-        <m:r>
-          <m:rPr>
-            <m:sty m:val="p"/>
-          </m:rPr>
-          <m:t>]</m:t>
-        </m:r>
-      </m:oMath>
-      <w:r>
-        <w:t xml:space="preserve">,</w:t>
-      </w:r>
-      <w:r>
-        <w:t xml:space="preserve"> </w:t>
-      </w:r>
-      <m:oMath>
-        <m:r>
-          <m:rPr>
-            <m:sty m:val="p"/>
-          </m:rPr>
-          <m:t>[</m:t>
-        </m:r>
-        <m:r>
-          <m:t>4</m:t>
-        </m:r>
-        <m:r>
-          <m:rPr>
-            <m:sty m:val="p"/>
-          </m:rPr>
-          <m:t>,</m:t>
-        </m:r>
-        <m:r>
-          <m:t>10</m:t>
-        </m:r>
-        <m:r>
-          <m:rPr>
-            <m:sty m:val="p"/>
-          </m:rPr>
-          <m:t>]</m:t>
-        </m:r>
-      </m:oMath>
-      <w:r>
-        <w:t xml:space="preserve">, and</w:t>
-      </w:r>
-      <w:r>
-        <w:t xml:space="preserve"> </w:t>
-      </w:r>
-      <m:oMath>
-        <m:r>
-          <m:rPr>
-            <m:sty m:val="p"/>
-          </m:rPr>
-          <m:t>[</m:t>
-        </m:r>
-        <m:r>
-          <m:t>1</m:t>
-        </m:r>
-        <m:r>
-          <m:rPr>
-            <m:sty m:val="p"/>
-          </m:rPr>
-          <m:t>,</m:t>
-        </m:r>
-        <m:r>
-          <m:t>2.5</m:t>
-        </m:r>
-        <m:r>
-          <m:rPr>
-            <m:sty m:val="p"/>
-          </m:rPr>
-          <m:t>]</m:t>
-        </m:r>
-      </m:oMath>
-      <w:r>
-        <w:t xml:space="preserve"> </w:t>
-      </w:r>
-      <w:r>
-        <w:t xml:space="preserve">respectively. All ten matches lie inside those bands.</w:t>
-      </w:r>
-    </w:p>
-    <w:p>
-      <w:pPr>
-        <w:pStyle w:val="BodyText"/>
-      </w:pPr>
-      <w:r>
-        <w:t xml:space="preserve">The curve is asymmetric. Micro-structure merges quickly, at about</w:t>
-      </w:r>
-      <w:r>
-        <w:t xml:space="preserve"> </w:t>
-      </w:r>
-      <m:oMath>
-        <m:r>
-          <m:t>1.6</m:t>
-        </m:r>
-      </m:oMath>
-      <w:r>
-        <w:t xml:space="preserve"> </w:t>
-      </w:r>
-      <w:r>
-        <w:t xml:space="preserve">clusters per metre from</w:t>
       </w:r>
       <w:r>
         <w:t xml:space="preserve"> </w:t>
@@ -4655,85 +4490,111 @@
             </m:sSub>
           </m:e>
         </m:bar>
-        <m:r>
-          <m:rPr>
-            <m:sty m:val="p"/>
-          </m:rPr>
-          <m:t>=</m:t>
-        </m:r>
-        <m:r>
-          <m:t>19</m:t>
-        </m:r>
-      </m:oMath>
-      <w:r>
-        <w:t xml:space="preserve"> </w:t>
-      </w:r>
-      <w:r>
-        <w:t xml:space="preserve">to</w:t>
-      </w:r>
-      <w:r>
-        <w:t xml:space="preserve"> </w:t>
-      </w:r>
-      <m:oMath>
-        <m:r>
-          <m:t>5</m:t>
-        </m:r>
-      </m:oMath>
-      <w:r>
-        <w:t xml:space="preserve">. Macro-structure then resists merging, at about</w:t>
-      </w:r>
-      <w:r>
-        <w:t xml:space="preserve"> </w:t>
-      </w:r>
-      <m:oMath>
-        <m:r>
-          <m:t>0.27</m:t>
-        </m:r>
-      </m:oMath>
-      <w:r>
-        <w:t xml:space="preserve"> </w:t>
-      </w:r>
-      <w:r>
-        <w:t xml:space="preserve">clusters per metre from</w:t>
-      </w:r>
-      <w:r>
-        <w:t xml:space="preserve"> </w:t>
-      </w:r>
-      <m:oMath>
-        <m:r>
-          <m:t>5</m:t>
-        </m:r>
-      </m:oMath>
-      <w:r>
-        <w:t xml:space="preserve"> </w:t>
-      </w:r>
-      <w:r>
-        <w:t xml:space="preserve">to</w:t>
-      </w:r>
-      <w:r>
-        <w:t xml:space="preserve"> </w:t>
-      </w:r>
-      <m:oMath>
-        <m:r>
-          <m:t>2</m:t>
-        </m:r>
-      </m:oMath>
-      <w:r>
-        <w:t xml:space="preserve">. The remaining gaps are the large between-group distances. That flattening is why the team cutoff sits far out at</w:t>
-      </w:r>
-      <w:r>
-        <w:t xml:space="preserve"> </w:t>
-      </w:r>
-      <m:oMath>
-        <m:r>
-          <m:t>23.0</m:t>
-        </m:r>
-      </m:oMath>
-      <w:r>
-        <w:t xml:space="preserve"> </w:t>
-      </w:r>
-      <w:r>
-        <w:t xml:space="preserve">m and still returns two envelopes, not two teams.</w:t>
+      </m:oMath>
+      <w:r>
+        <w:t xml:space="preserve"> </w:t>
+      </w:r>
+      <w:r>
+        <w:t xml:space="preserve">at the pooled cutoff to lie in</w:t>
+      </w:r>
+      <w:r>
+        <w:t xml:space="preserve"> </w:t>
+      </w:r>
+      <m:oMath>
+        <m:r>
+          <m:rPr>
+            <m:sty m:val="p"/>
+          </m:rPr>
+          <m:t>[</m:t>
+        </m:r>
+        <m:r>
+          <m:t>15</m:t>
+        </m:r>
+        <m:r>
+          <m:rPr>
+            <m:sty m:val="p"/>
+          </m:rPr>
+          <m:t>,</m:t>
+        </m:r>
+        <m:r>
+          <m:t>22</m:t>
+        </m:r>
+        <m:r>
+          <m:rPr>
+            <m:sty m:val="p"/>
+          </m:rPr>
+          <m:t>]</m:t>
+        </m:r>
+      </m:oMath>
+      <w:r>
+        <w:t xml:space="preserve">,</w:t>
+      </w:r>
+      <w:r>
+        <w:t xml:space="preserve"> </w:t>
+      </w:r>
+      <m:oMath>
+        <m:r>
+          <m:rPr>
+            <m:sty m:val="p"/>
+          </m:rPr>
+          <m:t>[</m:t>
+        </m:r>
+        <m:r>
+          <m:t>4</m:t>
+        </m:r>
+        <m:r>
+          <m:rPr>
+            <m:sty m:val="p"/>
+          </m:rPr>
+          <m:t>,</m:t>
+        </m:r>
+        <m:r>
+          <m:t>10</m:t>
+        </m:r>
+        <m:r>
+          <m:rPr>
+            <m:sty m:val="p"/>
+          </m:rPr>
+          <m:t>]</m:t>
+        </m:r>
+      </m:oMath>
+      <w:r>
+        <w:t xml:space="preserve">, and</w:t>
+      </w:r>
+      <w:r>
+        <w:t xml:space="preserve"> </w:t>
+      </w:r>
+      <m:oMath>
+        <m:r>
+          <m:rPr>
+            <m:sty m:val="p"/>
+          </m:rPr>
+          <m:t>[</m:t>
+        </m:r>
+        <m:r>
+          <m:t>1</m:t>
+        </m:r>
+        <m:r>
+          <m:rPr>
+            <m:sty m:val="p"/>
+          </m:rPr>
+          <m:t>,</m:t>
+        </m:r>
+        <m:r>
+          <m:t>2.5</m:t>
+        </m:r>
+        <m:r>
+          <m:rPr>
+            <m:sty m:val="p"/>
+          </m:rPr>
+          <m:t>]</m:t>
+        </m:r>
+      </m:oMath>
+      <w:r>
+        <w:t xml:space="preserve"> </w:t>
+      </w:r>
+      <w:r>
+        <w:t xml:space="preserve">respectively. All ten matches lie inside those bands.</w:t>
       </w:r>
     </w:p>
     <w:p>
@@ -4741,136 +4602,21 @@
         <w:pStyle w:val="BodyText"/>
       </w:pPr>
       <w:r>
-        <w:t xml:space="preserve">Clustering-quality diagnostics (Calinski–Harabasz, silhouette, and Shannon entropy of cluster sizes) are recorded on a deterministic</w:t>
-      </w:r>
-      <w:r>
-        <w:t xml:space="preserve"> </w:t>
-      </w:r>
-      <m:oMath>
-        <m:r>
-          <m:t>1</m:t>
-        </m:r>
-      </m:oMath>
-      <w:r>
-        <w:t xml:space="preserve"> </w:t>
-      </w:r>
-      <w:r>
-        <w:t xml:space="preserve">Hz subset (every 10th complete frame). Silhouette is omitted when</w:t>
-      </w:r>
-      <w:r>
-        <w:t xml:space="preserve"> </w:t>
-      </w:r>
-      <m:oMath>
-        <m:r>
-          <m:t>k</m:t>
-        </m:r>
-        <m:r>
-          <m:rPr>
-            <m:sty m:val="p"/>
-          </m:rPr>
-          <m:t>=</m:t>
-        </m:r>
-        <m:r>
-          <m:t>1</m:t>
-        </m:r>
-      </m:oMath>
-      <w:r>
-        <w:t xml:space="preserve">; it is not coded as</w:t>
-      </w:r>
-      <w:r>
-        <w:t xml:space="preserve"> </w:t>
-      </w:r>
-      <m:oMath>
-        <m:r>
-          <m:t>0</m:t>
-        </m:r>
-      </m:oMath>
-      <w:r>
-        <w:t xml:space="preserve">. Those curves are alternatives, not adopted cutoffs, and are reported in Supplementary Figure S2. Figure 2 shows the estimator and its spatial realisation. Section 3.4 reports how tactical</w:t>
-      </w:r>
-      <w:r>
-        <w:t xml:space="preserve"> </w:t>
-      </w:r>
-      <m:oMath>
-        <m:sSub>
-          <m:e>
-            <m:r>
-              <m:t>H</m:t>
-            </m:r>
-          </m:e>
-          <m:sub>
-            <m:r>
-              <m:t>1</m:t>
-            </m:r>
-          </m:sub>
-        </m:sSub>
-      </m:oMath>
-      <w:r>
-        <w:t xml:space="preserve"> </w:t>
-      </w:r>
-      <w:r>
-        <w:t xml:space="preserve">detection responds to the cutoff choice.</w:t>
-      </w:r>
-    </w:p>
-    <w:p>
-      <w:pPr>
-        <w:pStyle w:val="BlockText"/>
-      </w:pPr>
-      <w:r>
-        <w:rPr>
-          <w:b/>
-          <w:bCs/>
-        </w:rPr>
-        <w:t xml:space="preserve">Figure 2</w:t>
-      </w:r>
-      <w:r>
-        <w:t xml:space="preserve"> </w:t>
-      </w:r>
-      <w:r>
-        <w:t xml:space="preserve">(</w:t>
-      </w:r>
-      <w:r>
-        <w:rPr>
-          <w:rStyle w:val="VerbatimChar"/>
-        </w:rPr>
-        <w:t xml:space="preserve">figures/fig2_cutoff_sweep.pdf</w:t>
-      </w:r>
-      <w:r>
-        <w:t xml:space="preserve">). Cutoff selection by cardinality inversion, on all complete frames of the ten SkillCorner matches (436{,}648 frames); not</w:t>
-      </w:r>
-      <w:r>
-        <w:t xml:space="preserve"> </w:t>
-      </w:r>
-      <m:oMath>
-        <m:acc>
-          <m:accPr>
-            <m:chr m:val="̃"/>
-          </m:accPr>
-          <m:e>
-            <m:r>
-              <m:t>T</m:t>
-            </m:r>
-          </m:e>
-        </m:acc>
-      </m:oMath>
-      <w:r>
-        <w:t xml:space="preserve">.</w:t>
-      </w:r>
-      <w:r>
-        <w:t xml:space="preserve"> </w:t>
-      </w:r>
-      <w:r>
-        <w:rPr>
-          <w:b/>
-          <w:bCs/>
-        </w:rPr>
-        <w:t xml:space="preserve">(a)</w:t>
-      </w:r>
-      <w:r>
-        <w:t xml:space="preserve"> </w:t>
-      </w:r>
-      <w:r>
-        <w:t xml:space="preserve">Pooled mean</w:t>
+        <w:t xml:space="preserve">The curve is asymmetric. Nearby agents merge quickly, at about</w:t>
+      </w:r>
+      <w:r>
+        <w:t xml:space="preserve"> </w:t>
+      </w:r>
+      <m:oMath>
+        <m:r>
+          <m:t>1.6</m:t>
+        </m:r>
+      </m:oMath>
+      <w:r>
+        <w:t xml:space="preserve"> </w:t>
+      </w:r>
+      <w:r>
+        <w:t xml:space="preserve">groups per metre from</w:t>
       </w:r>
       <w:r>
         <w:t xml:space="preserve"> </w:t>
@@ -4899,23 +4645,218 @@
           <m:rPr>
             <m:sty m:val="p"/>
           </m:rPr>
-          <m:t>(</m:t>
-        </m:r>
-        <m:r>
-          <m:t>δ</m:t>
-        </m:r>
-        <m:r>
-          <m:rPr>
-            <m:sty m:val="p"/>
-          </m:rPr>
-          <m:t>)</m:t>
-        </m:r>
-      </m:oMath>
-      <w:r>
-        <w:t xml:space="preserve"> </w:t>
-      </w:r>
-      <w:r>
-        <w:t xml:space="preserve">(black) with the ten per-match curves (grey); targets are roster statements</w:t>
+          <m:t>=</m:t>
+        </m:r>
+        <m:r>
+          <m:t>19</m:t>
+        </m:r>
+      </m:oMath>
+      <w:r>
+        <w:t xml:space="preserve"> </w:t>
+      </w:r>
+      <w:r>
+        <w:t xml:space="preserve">to</w:t>
+      </w:r>
+      <w:r>
+        <w:t xml:space="preserve"> </w:t>
+      </w:r>
+      <m:oMath>
+        <m:r>
+          <m:t>5</m:t>
+        </m:r>
+      </m:oMath>
+      <w:r>
+        <w:t xml:space="preserve">. Larger gaps then resist merging, at about</w:t>
+      </w:r>
+      <w:r>
+        <w:t xml:space="preserve"> </w:t>
+      </w:r>
+      <m:oMath>
+        <m:r>
+          <m:t>0.27</m:t>
+        </m:r>
+      </m:oMath>
+      <w:r>
+        <w:t xml:space="preserve"> </w:t>
+      </w:r>
+      <w:r>
+        <w:t xml:space="preserve">groups per metre from</w:t>
+      </w:r>
+      <w:r>
+        <w:t xml:space="preserve"> </w:t>
+      </w:r>
+      <m:oMath>
+        <m:r>
+          <m:t>5</m:t>
+        </m:r>
+      </m:oMath>
+      <w:r>
+        <w:t xml:space="preserve"> </w:t>
+      </w:r>
+      <w:r>
+        <w:t xml:space="preserve">to</w:t>
+      </w:r>
+      <w:r>
+        <w:t xml:space="preserve"> </w:t>
+      </w:r>
+      <m:oMath>
+        <m:r>
+          <m:t>2</m:t>
+        </m:r>
+      </m:oMath>
+      <w:r>
+        <w:t xml:space="preserve">. The remaining gaps are the large between-group distances. That flattening is why the team cutoff sits far out at</w:t>
+      </w:r>
+      <w:r>
+        <w:t xml:space="preserve"> </w:t>
+      </w:r>
+      <m:oMath>
+        <m:r>
+          <m:t>23.0</m:t>
+        </m:r>
+      </m:oMath>
+      <w:r>
+        <w:t xml:space="preserve"> </w:t>
+      </w:r>
+      <w:r>
+        <w:t xml:space="preserve">m and still returns two envelopes, not two teams.</w:t>
+      </w:r>
+    </w:p>
+    <w:p>
+      <w:pPr>
+        <w:pStyle w:val="BodyText"/>
+      </w:pPr>
+      <w:r>
+        <w:t xml:space="preserve">Clustering-quality diagnostics (Calinski–Harabasz, silhouette, and Shannon entropy of cluster sizes) are recorded on a deterministic</w:t>
+      </w:r>
+      <w:r>
+        <w:t xml:space="preserve"> </w:t>
+      </w:r>
+      <m:oMath>
+        <m:r>
+          <m:t>1</m:t>
+        </m:r>
+      </m:oMath>
+      <w:r>
+        <w:t xml:space="preserve"> </w:t>
+      </w:r>
+      <w:r>
+        <w:t xml:space="preserve">Hz subset (every 10th complete frame). Silhouette is omitted when</w:t>
+      </w:r>
+      <w:r>
+        <w:t xml:space="preserve"> </w:t>
+      </w:r>
+      <m:oMath>
+        <m:r>
+          <m:t>k</m:t>
+        </m:r>
+        <m:r>
+          <m:rPr>
+            <m:sty m:val="p"/>
+          </m:rPr>
+          <m:t>=</m:t>
+        </m:r>
+        <m:r>
+          <m:t>1</m:t>
+        </m:r>
+      </m:oMath>
+      <w:r>
+        <w:t xml:space="preserve">; it is not coded as</w:t>
+      </w:r>
+      <w:r>
+        <w:t xml:space="preserve"> </w:t>
+      </w:r>
+      <m:oMath>
+        <m:r>
+          <m:t>0</m:t>
+        </m:r>
+      </m:oMath>
+      <w:r>
+        <w:t xml:space="preserve">. Those curves are alternatives, not adopted cutoffs, and are reported in Supplementary Figure S2. Figure 2 shows the estimator and its spatial realisation. Section 3.4 reports how tactical</w:t>
+      </w:r>
+      <w:r>
+        <w:t xml:space="preserve"> </w:t>
+      </w:r>
+      <m:oMath>
+        <m:sSub>
+          <m:e>
+            <m:r>
+              <m:t>H</m:t>
+            </m:r>
+          </m:e>
+          <m:sub>
+            <m:r>
+              <m:t>1</m:t>
+            </m:r>
+          </m:sub>
+        </m:sSub>
+      </m:oMath>
+      <w:r>
+        <w:t xml:space="preserve"> </w:t>
+      </w:r>
+      <w:r>
+        <w:t xml:space="preserve">detection responds to the cutoff choice.</w:t>
+      </w:r>
+    </w:p>
+    <w:p>
+      <w:pPr>
+        <w:pStyle w:val="BlockText"/>
+      </w:pPr>
+      <w:r>
+        <w:rPr>
+          <w:b/>
+          <w:bCs/>
+        </w:rPr>
+        <w:t xml:space="preserve">Figure 2</w:t>
+      </w:r>
+      <w:r>
+        <w:t xml:space="preserve"> </w:t>
+      </w:r>
+      <w:r>
+        <w:t xml:space="preserve">(</w:t>
+      </w:r>
+      <w:r>
+        <w:rPr>
+          <w:rStyle w:val="VerbatimChar"/>
+        </w:rPr>
+        <w:t xml:space="preserve">figures/fig2_cutoff_sweep.pdf</w:t>
+      </w:r>
+      <w:r>
+        <w:t xml:space="preserve">). Cutoff selection from the group-count curve, on all complete frames of the ten SkillCorner matches (436{,}648 frames); not</w:t>
+      </w:r>
+      <w:r>
+        <w:t xml:space="preserve"> </w:t>
+      </w:r>
+      <m:oMath>
+        <m:acc>
+          <m:accPr>
+            <m:chr m:val="̃"/>
+          </m:accPr>
+          <m:e>
+            <m:r>
+              <m:t>T</m:t>
+            </m:r>
+          </m:e>
+        </m:acc>
+      </m:oMath>
+      <w:r>
+        <w:t xml:space="preserve">.</w:t>
+      </w:r>
+      <w:r>
+        <w:t xml:space="preserve"> </w:t>
+      </w:r>
+      <w:r>
+        <w:rPr>
+          <w:b/>
+          <w:bCs/>
+        </w:rPr>
+        <w:t xml:space="preserve">(a)</w:t>
+      </w:r>
+      <w:r>
+        <w:t xml:space="preserve"> </w:t>
+      </w:r>
+      <w:r>
+        <w:t xml:space="preserve">Pooled mean group-count curve</w:t>
       </w:r>
       <w:r>
         <w:t xml:space="preserve"> </w:t>
@@ -4944,6 +4885,51 @@
           <m:rPr>
             <m:sty m:val="p"/>
           </m:rPr>
+          <m:t>(</m:t>
+        </m:r>
+        <m:r>
+          <m:t>δ</m:t>
+        </m:r>
+        <m:r>
+          <m:rPr>
+            <m:sty m:val="p"/>
+          </m:rPr>
+          <m:t>)</m:t>
+        </m:r>
+      </m:oMath>
+      <w:r>
+        <w:t xml:space="preserve"> </w:t>
+      </w:r>
+      <w:r>
+        <w:t xml:space="preserve">(black) with the ten per-match curves (grey); targets are roster statements</w:t>
+      </w:r>
+      <w:r>
+        <w:t xml:space="preserve"> </w:t>
+      </w:r>
+      <m:oMath>
+        <m:bar>
+          <m:barPr>
+            <m:pos m:val="top"/>
+          </m:barPr>
+          <m:e>
+            <m:sSub>
+              <m:e>
+                <m:r>
+                  <m:t>H</m:t>
+                </m:r>
+              </m:e>
+              <m:sub>
+                <m:r>
+                  <m:t>0</m:t>
+                </m:r>
+              </m:sub>
+            </m:sSub>
+          </m:e>
+        </m:bar>
+        <m:r>
+          <m:rPr>
+            <m:sty m:val="p"/>
+          </m:rPr>
           <m:t>=</m:t>
         </m:r>
         <m:r>
@@ -4968,7 +4954,7 @@
         <w:t xml:space="preserve"> </w:t>
       </w:r>
       <w:r>
-        <w:t xml:space="preserve">(a few coordinating groups, loop-feasible), and</w:t>
+        <w:t xml:space="preserve">(a few coordinating groups, enough that a loop remains possible), and</w:t>
       </w:r>
       <w:r>
         <w:t xml:space="preserve"> </w:t>
@@ -5183,7 +5169,7 @@
         <w:t xml:space="preserve"> </w:t>
       </w:r>
       <w:r>
-        <w:t xml:space="preserve">is the per-frame cluster count and</w:t>
+        <w:t xml:space="preserve">is the per-frame group count and</w:t>
       </w:r>
       <w:r>
         <w:t xml:space="preserve"> </w:t>
@@ -5878,7 +5864,7 @@
         <w:t xml:space="preserve"> </w:t>
       </w:r>
       <w:r>
-        <w:t xml:space="preserve">totals and frame-presence rates. The choice is therefore a reporting convention, not an optimisation.</w:t>
+        <w:t xml:space="preserve">totals and the same fraction of frames with a loop. The choice is therefore a reporting convention, not an optimisation.</w:t>
       </w:r>
     </w:p>
     <w:p>
@@ -5933,7 +5919,7 @@
         <w:t xml:space="preserve"> </w:t>
       </w:r>
       <w:r>
-        <w:t xml:space="preserve">bars. The Results use three summaries of those bars. None of them is a duration in seconds.</w:t>
+        <w:t xml:space="preserve">bars. The Results use three summaries of those bars.</w:t>
       </w:r>
       <w:r>
         <w:t xml:space="preserve"> </w:t>
@@ -5996,7 +5982,7 @@
         <w:t xml:space="preserve"> </w:t>
       </w:r>
       <w:r>
-        <w:t xml:space="preserve">is death minus birth, in metres on the Vietoris–Rips parameter: the length of a bar, not a duration in seconds.</w:t>
+        <w:t xml:space="preserve">is death minus birth: the length of a bar, in metres on the Vietoris–Rips parameter.</w:t>
       </w:r>
       <w:r>
         <w:t xml:space="preserve"> </w:t>
@@ -6026,7 +6012,7 @@
         <w:t xml:space="preserve"> </w:t>
       </w:r>
       <w:r>
-        <w:t xml:space="preserve">over the finite bars in a frame. It is the Spearman input in Section 3.5. The 150-frame subsample of Section 2.1 does not measure how long a loop lasts on the clock. The</w:t>
+        <w:t xml:space="preserve">over the finite bars in a frame. It is the Spearman input in Section 3.5. None of these summaries is a duration in seconds, and the 150-frame subsample of Section 2.1 does not measure how long a loop lasts on the clock. The</w:t>
       </w:r>
       <w:r>
         <w:t xml:space="preserve"> </w:t>
@@ -6156,21 +6142,7 @@
         </m:r>
       </m:oMath>
       <w:r>
-        <w:t xml:space="preserve">. Closed cycles of length at least</w:t>
-      </w:r>
-      <w:r>
-        <w:t xml:space="preserve"> </w:t>
-      </w:r>
-      <m:oMath>
-        <m:r>
-          <m:t>3</m:t>
-        </m:r>
-      </m:oMath>
-      <w:r>
-        <w:t xml:space="preserve"> </w:t>
-      </w:r>
-      <w:r>
-        <w:t xml:space="preserve">are then enumerated by breadth-first search from each vertex. If that graph yields no cycle, the search falls back to edges with length in</w:t>
+        <w:t xml:space="preserve">. Closed cycles of at least three vertices are then enumerated by breadth-first search from each vertex. If that graph yields no cycle, the search falls back to edges whose distances lie in</w:t>
       </w:r>
       <w:r>
         <w:t xml:space="preserve"> </w:t>
@@ -6225,7 +6197,7 @@
         </m:r>
       </m:oMath>
       <w:r>
-        <w:t xml:space="preserve">. Breadth-first search is used in preference to depth-first search because it prioritises shorter cycles. Those shorter cycles correspond to minimal enclosing arrangements. Among the enumerated cycles, the representative is the one whose edge distances lie closest to the midpoint of the persistence interval. This representative is a geometric proxy for the persistence pair, not a homology generator extracted from the matrix reduction.</w:t>
+        <w:t xml:space="preserve">. Breadth-first search is used in preference to depth-first search because it prioritises cycles with fewer vertices. Those cycles correspond to minimal enclosing arrangements. Among the enumerated cycles, the representative is the one whose edge distances lie closest to the midpoint of the persistence interval. This representative is a geometric proxy for the persistence pair, not a homology generator extracted from the matrix reduction.</w:t>
       </w:r>
     </w:p>
     <w:bookmarkEnd w:id="19"/>
@@ -6288,7 +6260,7 @@
         <w:t xml:space="preserve"> </w:t>
       </w:r>
       <w:r>
-        <w:t xml:space="preserve">points uniformly from the convex hull of those same centroids. Cardinality and spatial envelope are thus held fixed. Only the arrangement is randomised. The truncation of equation (1) is recomputed on each null cloud. Nothing else differs between the observed cloud and the null. We use</w:t>
+        <w:t xml:space="preserve">points uniformly from the convex hull of those same centroids. Group count and spatial envelope are thus held fixed. Only the arrangement is randomised. The truncation of equation (1) is recomputed on each null cloud. Nothing else differs between the observed cloud and the null. We use</w:t>
       </w:r>
       <w:r>
         <w:t xml:space="preserve"> </w:t>
@@ -6666,7 +6638,67 @@
         <w:pStyle w:val="FirstParagraph"/>
       </w:pPr>
       <w:r>
-        <w:t xml:space="preserve">Addressing Q1, the homology sample reproduces the three organisational levels inverted from the data in Section 2.3. Throughout,</w:t>
+        <w:t xml:space="preserve">Addressing Q1, the homology sample confirms the three organisational levels read from the group-count curve in Section 2.3. Those levels are individual (</w:t>
+      </w:r>
+      <m:oMath>
+        <m:r>
+          <m:t>δ</m:t>
+        </m:r>
+        <m:r>
+          <m:rPr>
+            <m:sty m:val="p"/>
+          </m:rPr>
+          <m:t>=</m:t>
+        </m:r>
+        <m:r>
+          <m:t>2.75</m:t>
+        </m:r>
+      </m:oMath>
+      <w:r>
+        <w:t xml:space="preserve"> </w:t>
+      </w:r>
+      <w:r>
+        <w:t xml:space="preserve">m), tactical (</w:t>
+      </w:r>
+      <m:oMath>
+        <m:r>
+          <m:t>δ</m:t>
+        </m:r>
+        <m:r>
+          <m:rPr>
+            <m:sty m:val="p"/>
+          </m:rPr>
+          <m:t>=</m:t>
+        </m:r>
+        <m:r>
+          <m:t>11.75</m:t>
+        </m:r>
+      </m:oMath>
+      <w:r>
+        <w:t xml:space="preserve"> </w:t>
+      </w:r>
+      <w:r>
+        <w:t xml:space="preserve">m), and team (</w:t>
+      </w:r>
+      <m:oMath>
+        <m:r>
+          <m:t>δ</m:t>
+        </m:r>
+        <m:r>
+          <m:rPr>
+            <m:sty m:val="p"/>
+          </m:rPr>
+          <m:t>=</m:t>
+        </m:r>
+        <m:r>
+          <m:t>23.0</m:t>
+        </m:r>
+      </m:oMath>
+      <w:r>
+        <w:t xml:space="preserve"> </w:t>
+      </w:r>
+      <w:r>
+        <w:t xml:space="preserve">m). Throughout,</w:t>
       </w:r>
       <w:r>
         <w:t xml:space="preserve"> </w:t>
@@ -6689,7 +6721,7 @@
         <w:t xml:space="preserve"> </w:t>
       </w:r>
       <w:r>
-        <w:t xml:space="preserve">is the number of cluster centroids. Equivalently, it is</w:t>
+        <w:t xml:space="preserve">is the group count: the number of centroids after clustering. Equivalently, it is</w:t>
       </w:r>
       <w:r>
         <w:t xml:space="preserve"> </w:t>
@@ -6740,27 +6772,7 @@
         <w:pStyle w:val="BodyText"/>
       </w:pPr>
       <w:r>
-        <w:t xml:space="preserve">At the individual level (</w:t>
-      </w:r>
-      <m:oMath>
-        <m:r>
-          <m:t>δ</m:t>
-        </m:r>
-        <m:r>
-          <m:rPr>
-            <m:sty m:val="p"/>
-          </m:rPr>
-          <m:t>=</m:t>
-        </m:r>
-        <m:r>
-          <m:t>2.75</m:t>
-        </m:r>
-      </m:oMath>
-      <w:r>
-        <w:t xml:space="preserve"> </w:t>
-      </w:r>
-      <w:r>
-        <w:t xml:space="preserve">m),</w:t>
+        <w:t xml:space="preserve">At the individual level,</w:t>
       </w:r>
       <w:r>
         <w:t xml:space="preserve"> </w:t>
@@ -6818,27 +6830,7 @@
         <w:t xml:space="preserve"> </w:t>
       </w:r>
       <w:r>
-        <w:t xml:space="preserve">s.d.; range 10–22). At the tactical level (</w:t>
-      </w:r>
-      <m:oMath>
-        <m:r>
-          <m:t>δ</m:t>
-        </m:r>
-        <m:r>
-          <m:rPr>
-            <m:sty m:val="p"/>
-          </m:rPr>
-          <m:t>=</m:t>
-        </m:r>
-        <m:r>
-          <m:t>11.75</m:t>
-        </m:r>
-      </m:oMath>
-      <w:r>
-        <w:t xml:space="preserve"> </w:t>
-      </w:r>
-      <w:r>
-        <w:t xml:space="preserve">m),</w:t>
+        <w:t xml:space="preserve">s.d.; range 10–22). At the tactical level,</w:t>
       </w:r>
       <w:r>
         <w:t xml:space="preserve"> </w:t>
@@ -6879,27 +6871,7 @@
         <w:t xml:space="preserve"> </w:t>
       </w:r>
       <w:r>
-        <w:t xml:space="preserve">(range 2–10). At the team level (</w:t>
-      </w:r>
-      <m:oMath>
-        <m:r>
-          <m:t>δ</m:t>
-        </m:r>
-        <m:r>
-          <m:rPr>
-            <m:sty m:val="p"/>
-          </m:rPr>
-          <m:t>=</m:t>
-        </m:r>
-        <m:r>
-          <m:t>23.0</m:t>
-        </m:r>
-      </m:oMath>
-      <w:r>
-        <w:t xml:space="preserve"> </w:t>
-      </w:r>
-      <w:r>
-        <w:t xml:space="preserve">m), the cloud usually collapses to one or two clusters: mean</w:t>
+        <w:t xml:space="preserve">(range 2–10). At the team level, the cloud usually collapses to one or two groups: mean</w:t>
       </w:r>
       <w:r>
         <w:t xml:space="preserve"> </w:t>
@@ -6919,7 +6891,7 @@
         </m:r>
       </m:oMath>
       <w:r>
-        <w:t xml:space="preserve">. All 22 players lie in a single cluster in 8.7% of frames, split across two in 86.7%, and across three in 4.7%.</w:t>
+        <w:t xml:space="preserve">. All 22 players lie in a single group in 8.7% of frames, split across two in 86.7%, and across three in 4.7%.</w:t>
       </w:r>
     </w:p>
     <w:p>
@@ -7003,47 +6975,7 @@
         </m:r>
       </m:oMath>
       <w:r>
-        <w:t xml:space="preserve">, and team cluster count</w:t>
-      </w:r>
-      <w:r>
-        <w:t xml:space="preserve"> </w:t>
-      </w:r>
-      <m:oMath>
-        <m:r>
-          <m:t>1.98</m:t>
-        </m:r>
-        <m:r>
-          <m:rPr>
-            <m:sty m:val="p"/>
-          </m:rPr>
-          <m:t>±</m:t>
-        </m:r>
-        <m:r>
-          <m:t>0.06</m:t>
-        </m:r>
-      </m:oMath>
-      <w:r>
-        <w:t xml:space="preserve"> </w:t>
-      </w:r>
-      <w:r>
-        <w:t xml:space="preserve">(mean</w:t>
-      </w:r>
-      <w:r>
-        <w:t xml:space="preserve"> </w:t>
-      </w:r>
-      <m:oMath>
-        <m:r>
-          <m:rPr>
-            <m:sty m:val="p"/>
-          </m:rPr>
-          <m:t>±</m:t>
-        </m:r>
-      </m:oMath>
-      <w:r>
-        <w:t xml:space="preserve"> </w:t>
-      </w:r>
-      <w:r>
-        <w:t xml:space="preserve">s.d. across matches). Every match stays within the validated</w:t>
+        <w:t xml:space="preserve">, and team</w:t>
       </w:r>
       <w:r>
         <w:t xml:space="preserve"> </w:t>
@@ -7061,12 +6993,47 @@
             </m:r>
           </m:sub>
         </m:sSub>
-      </m:oMath>
-      <w:r>
-        <w:t xml:space="preserve"> </w:t>
-      </w:r>
-      <w:r>
-        <w:t xml:space="preserve">bands of Section 2.3: the ten per-match means all fall inside the acceptance intervals</w:t>
+        <m:r>
+          <m:rPr>
+            <m:sty m:val="p"/>
+          </m:rPr>
+          <m:t>=</m:t>
+        </m:r>
+        <m:r>
+          <m:t>1.98</m:t>
+        </m:r>
+        <m:r>
+          <m:rPr>
+            <m:sty m:val="p"/>
+          </m:rPr>
+          <m:t>±</m:t>
+        </m:r>
+        <m:r>
+          <m:t>0.06</m:t>
+        </m:r>
+      </m:oMath>
+      <w:r>
+        <w:t xml:space="preserve"> </w:t>
+      </w:r>
+      <w:r>
+        <w:t xml:space="preserve">(mean</w:t>
+      </w:r>
+      <w:r>
+        <w:t xml:space="preserve"> </w:t>
+      </w:r>
+      <m:oMath>
+        <m:r>
+          <m:rPr>
+            <m:sty m:val="p"/>
+          </m:rPr>
+          <m:t>±</m:t>
+        </m:r>
+      </m:oMath>
+      <w:r>
+        <w:t xml:space="preserve"> </w:t>
+      </w:r>
+      <w:r>
+        <w:t xml:space="preserve">s.d. across matches). Every match stays within the acceptance intervals of Section 2.3: the ten per-match means all fall inside</w:t>
       </w:r>
       <w:r>
         <w:t xml:space="preserve"> </w:t>
@@ -7179,7 +7146,7 @@
         <w:t xml:space="preserve"> </w:t>
       </w:r>
       <w:r>
-        <w:t xml:space="preserve">clusters merge per metre from the individual to the tactical level, but only</w:t>
+        <w:t xml:space="preserve">groups merge per metre from the individual to the tactical level, but only</w:t>
       </w:r>
       <w:r>
         <w:t xml:space="preserve"> </w:t>
@@ -7207,7 +7174,7 @@
         <w:t xml:space="preserve"> </w:t>
       </w:r>
       <w:r>
-        <w:t xml:space="preserve">(Figure 2a). The spatial realisation on one frame (Figure 2d–f) shows the same regimes: a near-atomic cloud at</w:t>
+        <w:t xml:space="preserve">(Figure 2a). The spatial realisation on one frame (Figure 2d–f) shows the same regimes: a mostly resolved set of agents at</w:t>
       </w:r>
       <w:r>
         <w:t xml:space="preserve"> </w:t>
@@ -7221,7 +7188,7 @@
         <w:t xml:space="preserve"> </w:t>
       </w:r>
       <w:r>
-        <w:t xml:space="preserve">m, coordinating groups at</w:t>
+        <w:t xml:space="preserve">m, a handful of coordinating groups at</w:t>
       </w:r>
       <w:r>
         <w:t xml:space="preserve"> </w:t>
@@ -7290,7 +7257,7 @@
         <w:pStyle w:val="FirstParagraph"/>
       </w:pPr>
       <w:r>
-        <w:t xml:space="preserve">Addressing Q2, scale-attributable homology detects loop structure at two of the three recovered levels. On the primary match, the pipeline detects</w:t>
+        <w:t xml:space="preserve">For Q2, scale-attributable homology detects loop structure at two of the three recovered levels. On the primary match, the pipeline detects</w:t>
       </w:r>
       <w:r>
         <w:t xml:space="preserve"> </w:t>
@@ -7791,9 +7758,6 @@
                 <m:t>378</m:t>
               </m:r>
             </m:oMath>
-            <w:r>
-              <w:t xml:space="preserve">​</w:t>
-            </w:r>
           </w:p>
         </w:tc>
         <w:tc>
@@ -7849,9 +7813,6 @@
                 <m:t>2.52</m:t>
               </m:r>
             </m:oMath>
-            <w:r>
-              <w:t xml:space="preserve">​</w:t>
-            </w:r>
           </w:p>
         </w:tc>
         <w:tc>
@@ -7874,9 +7835,6 @@
                 <m:t>1.735</m:t>
               </m:r>
             </m:oMath>
-            <w:r>
-              <w:t xml:space="preserve">​</w:t>
-            </w:r>
           </w:p>
         </w:tc>
         <w:tc>
@@ -7890,9 +7848,6 @@
                 <m:t>12.991</m:t>
               </m:r>
             </m:oMath>
-            <w:r>
-              <w:t xml:space="preserve">​</w:t>
-            </w:r>
           </w:p>
         </w:tc>
       </w:tr>
@@ -7930,9 +7885,6 @@
                 <m:t>25</m:t>
               </m:r>
             </m:oMath>
-            <w:r>
-              <w:t xml:space="preserve">​</w:t>
-            </w:r>
           </w:p>
         </w:tc>
         <w:tc>
@@ -7988,9 +7940,6 @@
                 <m:t>0.17</m:t>
               </m:r>
             </m:oMath>
-            <w:r>
-              <w:t xml:space="preserve">​</w:t>
-            </w:r>
           </w:p>
         </w:tc>
         <w:tc>
@@ -8013,9 +7962,6 @@
                 <m:t>2.723</m:t>
               </m:r>
             </m:oMath>
-            <w:r>
-              <w:t xml:space="preserve">​</w:t>
-            </w:r>
           </w:p>
         </w:tc>
         <w:tc>
@@ -8029,9 +7975,6 @@
                 <m:t>10.771</m:t>
               </m:r>
             </m:oMath>
-            <w:r>
-              <w:t xml:space="preserve">​</w:t>
-            </w:r>
           </w:p>
         </w:tc>
       </w:tr>
@@ -8069,9 +8012,6 @@
                 <m:t>0</m:t>
               </m:r>
             </m:oMath>
-            <w:r>
-              <w:t xml:space="preserve">​</w:t>
-            </w:r>
           </w:p>
         </w:tc>
         <w:tc>
@@ -8983,9 +8923,6 @@
                 <m:t>039</m:t>
               </m:r>
             </m:oMath>
-            <w:r>
-              <w:t xml:space="preserve">​</w:t>
-            </w:r>
           </w:p>
         </w:tc>
         <w:tc>
@@ -9014,9 +8951,6 @@
                 <m:t>%</m:t>
               </m:r>
             </m:oMath>
-            <w:r>
-              <w:t xml:space="preserve">​</w:t>
-            </w:r>
           </w:p>
         </w:tc>
         <w:tc>
@@ -9051,9 +8985,6 @@
                 <m:t>1.886</m:t>
               </m:r>
             </m:oMath>
-            <w:r>
-              <w:t xml:space="preserve">​</w:t>
-            </w:r>
           </w:p>
         </w:tc>
         <w:tc>
@@ -9067,9 +8998,6 @@
                 <m:t>0.145</m:t>
               </m:r>
             </m:oMath>
-            <w:r>
-              <w:t xml:space="preserve">​</w:t>
-            </w:r>
           </w:p>
         </w:tc>
       </w:tr>
@@ -9096,9 +9024,6 @@
                 <m:t>306</m:t>
               </m:r>
             </m:oMath>
-            <w:r>
-              <w:t xml:space="preserve">​</w:t>
-            </w:r>
           </w:p>
         </w:tc>
         <w:tc>
@@ -9127,9 +9052,6 @@
                 <m:t>%</m:t>
               </m:r>
             </m:oMath>
-            <w:r>
-              <w:t xml:space="preserve">​</w:t>
-            </w:r>
           </w:p>
         </w:tc>
         <w:tc>
@@ -9164,9 +9086,6 @@
                 <m:t>3.411</m:t>
               </m:r>
             </m:oMath>
-            <w:r>
-              <w:t xml:space="preserve">​</w:t>
-            </w:r>
           </w:p>
         </w:tc>
         <w:tc>
@@ -9180,9 +9099,6 @@
                 <m:t>0.419</m:t>
               </m:r>
             </m:oMath>
-            <w:r>
-              <w:t xml:space="preserve">​</w:t>
-            </w:r>
           </w:p>
         </w:tc>
       </w:tr>
@@ -9209,9 +9125,6 @@
                 <m:t>0</m:t>
               </m:r>
             </m:oMath>
-            <w:r>
-              <w:t xml:space="preserve">​</w:t>
-            </w:r>
           </w:p>
         </w:tc>
         <w:tc>
@@ -9240,9 +9153,6 @@
                 <m:t>%</m:t>
               </m:r>
             </m:oMath>
-            <w:r>
-              <w:t xml:space="preserve">​</w:t>
-            </w:r>
           </w:p>
         </w:tc>
         <w:tc>
@@ -9285,7 +9195,7 @@
         <w:pStyle w:val="BodyText"/>
       </w:pPr>
       <w:r>
-        <w:t xml:space="preserve">The tactical level sits close to a cardinality floor. In the ten-match sample,</w:t>
+        <w:t xml:space="preserve">The tactical level sits close to a group-count floor. In the ten-match sample,</w:t>
       </w:r>
       <w:r>
         <w:t xml:space="preserve"> </w:t>
@@ -9305,7 +9215,7 @@
         <w:t xml:space="preserve"> </w:t>
       </w:r>
       <w:r>
-        <w:t xml:space="preserve">of frames have four or fewer tactical centroids, and none of them carries a loop. Presence rate alone cannot tell arrangement from cluster count. We separate the two with the matched null of Section 2.6, which fixes centroid number and spatial envelope and randomises only arrangement.</w:t>
+        <w:t xml:space="preserve">of frames have four or fewer tactical groups, and none of them carries a loop. Presence rate alone cannot tell arrangement from group count. We separate the two with the matched null of Section 2.6, which fixes group count and spatial envelope and randomises only arrangement.</w:t>
       </w:r>
     </w:p>
     <w:p>
@@ -9313,7 +9223,7 @@
         <w:pStyle w:val="BodyText"/>
       </w:pPr>
       <w:r>
-        <w:t xml:space="preserve">Table 3 summarises the result. Tactical observed presence is more than twice the null rate. Table 4 splits by centroid count</w:t>
+        <w:t xml:space="preserve">Table 3 summarises the result. Tactical observed presence is more than twice the null rate. Table 4 splits by group count</w:t>
       </w:r>
       <w:r>
         <w:t xml:space="preserve"> </w:t>
@@ -9539,7 +9449,7 @@
         <w:t xml:space="preserve"> </w:t>
       </w:r>
       <w:r>
-        <w:t xml:space="preserve">presence against a cardinality- and envelope-matched null (</w:t>
+        <w:t xml:space="preserve">presence against a group-count- and envelope-matched null (</w:t>
       </w:r>
       <m:oMath>
         <m:r>
@@ -9726,9 +9636,6 @@
                 <m:t>%</m:t>
               </m:r>
             </m:oMath>
-            <w:r>
-              <w:t xml:space="preserve">​</w:t>
-            </w:r>
           </w:p>
         </w:tc>
         <w:tc>
@@ -9748,9 +9655,6 @@
                 <m:t>%</m:t>
               </m:r>
             </m:oMath>
-            <w:r>
-              <w:t xml:space="preserve">​</w:t>
-            </w:r>
           </w:p>
         </w:tc>
         <w:tc>
@@ -9770,9 +9674,6 @@
                 <m:t>5.1</m:t>
               </m:r>
             </m:oMath>
-            <w:r>
-              <w:t xml:space="preserve">​</w:t>
-            </w:r>
           </w:p>
         </w:tc>
         <w:tc>
@@ -9819,9 +9720,6 @@
                 <m:t>]</m:t>
               </m:r>
             </m:oMath>
-            <w:r>
-              <w:t xml:space="preserve">​</w:t>
-            </w:r>
           </w:p>
         </w:tc>
       </w:tr>
@@ -9854,9 +9752,6 @@
                 <m:t>%</m:t>
               </m:r>
             </m:oMath>
-            <w:r>
-              <w:t xml:space="preserve">​</w:t>
-            </w:r>
           </w:p>
         </w:tc>
         <w:tc>
@@ -9876,9 +9771,6 @@
                 <m:t>%</m:t>
               </m:r>
             </m:oMath>
-            <w:r>
-              <w:t xml:space="preserve">​</w:t>
-            </w:r>
           </w:p>
         </w:tc>
         <w:tc>
@@ -9898,9 +9790,6 @@
                 <m:t>9.7</m:t>
               </m:r>
             </m:oMath>
-            <w:r>
-              <w:t xml:space="preserve">​</w:t>
-            </w:r>
           </w:p>
         </w:tc>
         <w:tc>
@@ -9947,9 +9836,6 @@
                 <m:t>]</m:t>
               </m:r>
             </m:oMath>
-            <w:r>
-              <w:t xml:space="preserve">​</w:t>
-            </w:r>
           </w:p>
         </w:tc>
       </w:tr>
@@ -9992,7 +9878,7 @@
         <w:t xml:space="preserve"> </w:t>
       </w:r>
       <w:r>
-        <w:t xml:space="preserve">presence by centroid count</w:t>
+        <w:t xml:space="preserve">presence by group count</w:t>
       </w:r>
       <w:r>
         <w:t xml:space="preserve"> </w:t>
@@ -10068,9 +9954,6 @@
                 <m:t>k</m:t>
               </m:r>
             </m:oMath>
-            <w:r>
-              <w:t xml:space="preserve">​</w:t>
-            </w:r>
           </w:p>
         </w:tc>
         <w:tc>
@@ -10136,9 +10019,6 @@
                 <m:t>4</m:t>
               </m:r>
             </m:oMath>
-            <w:r>
-              <w:t xml:space="preserve">​</w:t>
-            </w:r>
           </w:p>
         </w:tc>
         <w:tc>
@@ -10152,9 +10032,6 @@
                 <m:t>609</m:t>
               </m:r>
             </m:oMath>
-            <w:r>
-              <w:t xml:space="preserve">​</w:t>
-            </w:r>
           </w:p>
         </w:tc>
         <w:tc>
@@ -10174,9 +10051,6 @@
                 <m:t>%</m:t>
               </m:r>
             </m:oMath>
-            <w:r>
-              <w:t xml:space="preserve">​</w:t>
-            </w:r>
           </w:p>
         </w:tc>
         <w:tc>
@@ -10196,9 +10070,6 @@
                 <m:t>%</m:t>
               </m:r>
             </m:oMath>
-            <w:r>
-              <w:t xml:space="preserve">​</w:t>
-            </w:r>
           </w:p>
         </w:tc>
         <w:tc>
@@ -10218,9 +10089,6 @@
                 <m:t>0.4</m:t>
               </m:r>
             </m:oMath>
-            <w:r>
-              <w:t xml:space="preserve">​</w:t>
-            </w:r>
           </w:p>
         </w:tc>
       </w:tr>
@@ -10236,9 +10104,6 @@
                 <m:t>5</m:t>
               </m:r>
             </m:oMath>
-            <w:r>
-              <w:t xml:space="preserve">​</w:t>
-            </w:r>
           </w:p>
         </w:tc>
         <w:tc>
@@ -10252,9 +10117,6 @@
                 <m:t>344</m:t>
               </m:r>
             </m:oMath>
-            <w:r>
-              <w:t xml:space="preserve">​</w:t>
-            </w:r>
           </w:p>
         </w:tc>
         <w:tc>
@@ -10274,9 +10136,6 @@
                 <m:t>%</m:t>
               </m:r>
             </m:oMath>
-            <w:r>
-              <w:t xml:space="preserve">​</w:t>
-            </w:r>
           </w:p>
         </w:tc>
         <w:tc>
@@ -10296,9 +10155,6 @@
                 <m:t>%</m:t>
               </m:r>
             </m:oMath>
-            <w:r>
-              <w:t xml:space="preserve">​</w:t>
-            </w:r>
           </w:p>
         </w:tc>
         <w:tc>
@@ -10318,9 +10174,6 @@
                 <m:t>5.2</m:t>
               </m:r>
             </m:oMath>
-            <w:r>
-              <w:t xml:space="preserve">​</w:t>
-            </w:r>
           </w:p>
         </w:tc>
       </w:tr>
@@ -10336,9 +10189,6 @@
                 <m:t>6</m:t>
               </m:r>
             </m:oMath>
-            <w:r>
-              <w:t xml:space="preserve">​</w:t>
-            </w:r>
           </w:p>
         </w:tc>
         <w:tc>
@@ -10352,9 +10202,6 @@
                 <m:t>252</m:t>
               </m:r>
             </m:oMath>
-            <w:r>
-              <w:t xml:space="preserve">​</w:t>
-            </w:r>
           </w:p>
         </w:tc>
         <w:tc>
@@ -10374,9 +10221,6 @@
                 <m:t>%</m:t>
               </m:r>
             </m:oMath>
-            <w:r>
-              <w:t xml:space="preserve">​</w:t>
-            </w:r>
           </w:p>
         </w:tc>
         <w:tc>
@@ -10396,9 +10240,6 @@
                 <m:t>%</m:t>
               </m:r>
             </m:oMath>
-            <w:r>
-              <w:t xml:space="preserve">​</w:t>
-            </w:r>
           </w:p>
         </w:tc>
         <w:tc>
@@ -10418,9 +10259,6 @@
                 <m:t>14.5</m:t>
               </m:r>
             </m:oMath>
-            <w:r>
-              <w:t xml:space="preserve">​</w:t>
-            </w:r>
           </w:p>
         </w:tc>
       </w:tr>
@@ -10436,9 +10274,6 @@
                 <m:t>7</m:t>
               </m:r>
             </m:oMath>
-            <w:r>
-              <w:t xml:space="preserve">​</w:t>
-            </w:r>
           </w:p>
         </w:tc>
         <w:tc>
@@ -10452,9 +10287,6 @@
                 <m:t>149</m:t>
               </m:r>
             </m:oMath>
-            <w:r>
-              <w:t xml:space="preserve">​</w:t>
-            </w:r>
           </w:p>
         </w:tc>
         <w:tc>
@@ -10474,9 +10306,6 @@
                 <m:t>%</m:t>
               </m:r>
             </m:oMath>
-            <w:r>
-              <w:t xml:space="preserve">​</w:t>
-            </w:r>
           </w:p>
         </w:tc>
         <w:tc>
@@ -10496,9 +10325,6 @@
                 <m:t>%</m:t>
               </m:r>
             </m:oMath>
-            <w:r>
-              <w:t xml:space="preserve">​</w:t>
-            </w:r>
           </w:p>
         </w:tc>
         <w:tc>
@@ -10518,9 +10344,6 @@
                 <m:t>29.3</m:t>
               </m:r>
             </m:oMath>
-            <w:r>
-              <w:t xml:space="preserve">​</w:t>
-            </w:r>
           </w:p>
         </w:tc>
       </w:tr>
@@ -10536,9 +10359,6 @@
                 <m:t>8</m:t>
               </m:r>
             </m:oMath>
-            <w:r>
-              <w:t xml:space="preserve">​</w:t>
-            </w:r>
           </w:p>
         </w:tc>
         <w:tc>
@@ -10552,9 +10372,6 @@
                 <m:t>94</m:t>
               </m:r>
             </m:oMath>
-            <w:r>
-              <w:t xml:space="preserve">​</w:t>
-            </w:r>
           </w:p>
         </w:tc>
         <w:tc>
@@ -10574,9 +10391,6 @@
                 <m:t>%</m:t>
               </m:r>
             </m:oMath>
-            <w:r>
-              <w:t xml:space="preserve">​</w:t>
-            </w:r>
           </w:p>
         </w:tc>
         <w:tc>
@@ -10596,9 +10410,6 @@
                 <m:t>%</m:t>
               </m:r>
             </m:oMath>
-            <w:r>
-              <w:t xml:space="preserve">​</w:t>
-            </w:r>
           </w:p>
         </w:tc>
         <w:tc>
@@ -10618,9 +10429,6 @@
                 <m:t>33.6</m:t>
               </m:r>
             </m:oMath>
-            <w:r>
-              <w:t xml:space="preserve">​</w:t>
-            </w:r>
           </w:p>
         </w:tc>
       </w:tr>
@@ -10642,9 +10450,6 @@
                 <m:t>9</m:t>
               </m:r>
             </m:oMath>
-            <w:r>
-              <w:t xml:space="preserve">​</w:t>
-            </w:r>
           </w:p>
         </w:tc>
         <w:tc>
@@ -10658,9 +10463,6 @@
                 <m:t>52</m:t>
               </m:r>
             </m:oMath>
-            <w:r>
-              <w:t xml:space="preserve">​</w:t>
-            </w:r>
           </w:p>
         </w:tc>
         <w:tc>
@@ -10680,9 +10482,6 @@
                 <m:t>%</m:t>
               </m:r>
             </m:oMath>
-            <w:r>
-              <w:t xml:space="preserve">​</w:t>
-            </w:r>
           </w:p>
         </w:tc>
         <w:tc>
@@ -10702,9 +10501,6 @@
                 <m:t>%</m:t>
               </m:r>
             </m:oMath>
-            <w:r>
-              <w:t xml:space="preserve">​</w:t>
-            </w:r>
           </w:p>
         </w:tc>
         <w:tc>
@@ -10724,9 +10520,6 @@
                 <m:t>35.6</m:t>
               </m:r>
             </m:oMath>
-            <w:r>
-              <w:t xml:space="preserve">​</w:t>
-            </w:r>
           </w:p>
         </w:tc>
       </w:tr>
@@ -10746,7 +10539,7 @@
         <w:pStyle w:val="FirstParagraph"/>
       </w:pPr>
       <w:r>
-        <w:t xml:space="preserve">Addressing the realisation part of Q2, all</w:t>
+        <w:t xml:space="preserve">All</w:t>
       </w:r>
       <w:r>
         <w:t xml:space="preserve"> </w:t>
@@ -10783,7 +10576,7 @@
         <w:t xml:space="preserve"> </w:t>
       </w:r>
       <w:r>
-        <w:t xml:space="preserve">features receive a geometric realisation via closed-cycle identification. The representative is the graph-cycle proxy of Section 2.5, not a generator from the reduction matrix. Cycles at the individual level form short rings of centroids (typically three to six nodes in the examples we inspected). Tactical cycles are similarly small (often four or five nodes) but span larger gaps and have larger filtration lifetime. Figure 3 shows the same sample frame at both levels, with the cutoff and the filtration drawn as separate panels (sample frame 95). The left column is the vertex set after clustering. The right column is the</w:t>
+        <w:t xml:space="preserve">features receive a geometric realisation via closed-cycle identification. The representative is the graph-cycle proxy of Section 2.5, not a generator from the reduction matrix. Cycles at the individual level form short rings of centroids (typically three to six vertices in the examples we inspected). Tactical cycles are similarly small (often four or five vertices) but span larger gaps and have larger filtration lifetime. Figure 3 shows the same sample frame at both levels, with the cutoff and the filtration drawn as separate panels (sample frame 95). The left column is the vertex set after clustering. The right column is the</w:t>
       </w:r>
       <w:r>
         <w:t xml:space="preserve"> </w:t>
@@ -11285,7 +11078,7 @@
         <w:t xml:space="preserve">figures/fig4_h1_diagrams.pdf</w:t>
       </w:r>
       <w:r>
-        <w:t xml:space="preserve">). Scale-separated finite</w:t>
+        <w:t xml:space="preserve">). Finite</w:t>
       </w:r>
       <w:r>
         <w:t xml:space="preserve"> </w:t>
@@ -11308,7 +11101,7 @@
         <w:t xml:space="preserve"> </w:t>
       </w:r>
       <w:r>
-        <w:t xml:space="preserve">bars on the primary match.</w:t>
+        <w:t xml:space="preserve">bars at two organisational levels on the primary match.</w:t>
       </w:r>
       <w:r>
         <w:t xml:space="preserve"> </w:t>
@@ -11474,7 +11267,7 @@
         <w:pStyle w:val="FirstParagraph"/>
       </w:pPr>
       <w:r>
-        <w:t xml:space="preserve">Addressing the robustness part of Q2, detection is not confined to the adopted cutoff or to a single truncation percentile. Tactical</w:t>
+        <w:t xml:space="preserve">Detection is not confined to the adopted cutoff or to a single truncation percentile. Tactical</w:t>
       </w:r>
       <w:r>
         <w:t xml:space="preserve"> </w:t>
@@ -11840,9 +11633,6 @@
                 <m:t>6</m:t>
               </m:r>
             </m:oMath>
-            <w:r>
-              <w:t xml:space="preserve">​</w:t>
-            </w:r>
           </w:p>
         </w:tc>
         <w:tc>
@@ -11856,9 +11646,6 @@
                 <m:t>275</m:t>
               </m:r>
             </m:oMath>
-            <w:r>
-              <w:t xml:space="preserve">​</w:t>
-            </w:r>
           </w:p>
         </w:tc>
         <w:tc>
@@ -11878,9 +11665,6 @@
                 <m:t>%</m:t>
               </m:r>
             </m:oMath>
-            <w:r>
-              <w:t xml:space="preserve">​</w:t>
-            </w:r>
           </w:p>
         </w:tc>
         <w:tc>
@@ -11894,9 +11678,6 @@
                 <m:t>13.4</m:t>
               </m:r>
             </m:oMath>
-            <w:r>
-              <w:t xml:space="preserve">​</w:t>
-            </w:r>
           </w:p>
         </w:tc>
       </w:tr>
@@ -11912,9 +11693,6 @@
                 <m:t>8</m:t>
               </m:r>
             </m:oMath>
-            <w:r>
-              <w:t xml:space="preserve">​</w:t>
-            </w:r>
           </w:p>
         </w:tc>
         <w:tc>
@@ -11928,9 +11706,6 @@
                 <m:t>162</m:t>
               </m:r>
             </m:oMath>
-            <w:r>
-              <w:t xml:space="preserve">​</w:t>
-            </w:r>
           </w:p>
         </w:tc>
         <w:tc>
@@ -11950,9 +11725,6 @@
                 <m:t>%</m:t>
               </m:r>
             </m:oMath>
-            <w:r>
-              <w:t xml:space="preserve">​</w:t>
-            </w:r>
           </w:p>
         </w:tc>
         <w:tc>
@@ -11966,9 +11738,6 @@
                 <m:t>9.8</m:t>
               </m:r>
             </m:oMath>
-            <w:r>
-              <w:t xml:space="preserve">​</w:t>
-            </w:r>
           </w:p>
         </w:tc>
       </w:tr>
@@ -11984,9 +11753,6 @@
                 <m:t>10</m:t>
               </m:r>
             </m:oMath>
-            <w:r>
-              <w:t xml:space="preserve">​</w:t>
-            </w:r>
           </w:p>
         </w:tc>
         <w:tc>
@@ -12000,9 +11766,6 @@
                 <m:t>78</m:t>
               </m:r>
             </m:oMath>
-            <w:r>
-              <w:t xml:space="preserve">​</w:t>
-            </w:r>
           </w:p>
         </w:tc>
         <w:tc>
@@ -12022,9 +11785,6 @@
                 <m:t>%</m:t>
               </m:r>
             </m:oMath>
-            <w:r>
-              <w:t xml:space="preserve">​</w:t>
-            </w:r>
           </w:p>
         </w:tc>
         <w:tc>
@@ -12038,9 +11798,6 @@
                 <m:t>7.0</m:t>
               </m:r>
             </m:oMath>
-            <w:r>
-              <w:t xml:space="preserve">​</w:t>
-            </w:r>
           </w:p>
         </w:tc>
       </w:tr>
@@ -12056,9 +11813,6 @@
                 <m:t>11.75</m:t>
               </m:r>
             </m:oMath>
-            <w:r>
-              <w:t xml:space="preserve">​</w:t>
-            </w:r>
           </w:p>
         </w:tc>
         <w:tc>
@@ -12072,9 +11826,6 @@
                 <m:t>25</m:t>
               </m:r>
             </m:oMath>
-            <w:r>
-              <w:t xml:space="preserve">​</w:t>
-            </w:r>
           </w:p>
         </w:tc>
         <w:tc>
@@ -12094,9 +11845,6 @@
                 <m:t>%</m:t>
               </m:r>
             </m:oMath>
-            <w:r>
-              <w:t xml:space="preserve">​</w:t>
-            </w:r>
           </w:p>
         </w:tc>
         <w:tc>
@@ -12110,9 +11858,6 @@
                 <m:t>5.0</m:t>
               </m:r>
             </m:oMath>
-            <w:r>
-              <w:t xml:space="preserve">​</w:t>
-            </w:r>
           </w:p>
         </w:tc>
       </w:tr>
@@ -12128,9 +11873,6 @@
                 <m:t>12</m:t>
               </m:r>
             </m:oMath>
-            <w:r>
-              <w:t xml:space="preserve">​</w:t>
-            </w:r>
           </w:p>
         </w:tc>
         <w:tc>
@@ -12144,9 +11886,6 @@
                 <m:t>21</m:t>
               </m:r>
             </m:oMath>
-            <w:r>
-              <w:t xml:space="preserve">​</w:t>
-            </w:r>
           </w:p>
         </w:tc>
         <w:tc>
@@ -12166,9 +11905,6 @@
                 <m:t>%</m:t>
               </m:r>
             </m:oMath>
-            <w:r>
-              <w:t xml:space="preserve">​</w:t>
-            </w:r>
           </w:p>
         </w:tc>
         <w:tc>
@@ -12182,9 +11918,6 @@
                 <m:t>4.8</m:t>
               </m:r>
             </m:oMath>
-            <w:r>
-              <w:t xml:space="preserve">​</w:t>
-            </w:r>
           </w:p>
         </w:tc>
       </w:tr>
@@ -12200,9 +11933,6 @@
                 <m:t>14</m:t>
               </m:r>
             </m:oMath>
-            <w:r>
-              <w:t xml:space="preserve">​</w:t>
-            </w:r>
           </w:p>
         </w:tc>
         <w:tc>
@@ -12216,9 +11946,6 @@
                 <m:t>5</m:t>
               </m:r>
             </m:oMath>
-            <w:r>
-              <w:t xml:space="preserve">​</w:t>
-            </w:r>
           </w:p>
         </w:tc>
         <w:tc>
@@ -12238,9 +11965,6 @@
                 <m:t>%</m:t>
               </m:r>
             </m:oMath>
-            <w:r>
-              <w:t xml:space="preserve">​</w:t>
-            </w:r>
           </w:p>
         </w:tc>
         <w:tc>
@@ -12254,9 +11978,6 @@
                 <m:t>3.5</m:t>
               </m:r>
             </m:oMath>
-            <w:r>
-              <w:t xml:space="preserve">​</w:t>
-            </w:r>
           </w:p>
         </w:tc>
       </w:tr>
@@ -12272,9 +11993,6 @@
                 <m:t>16</m:t>
               </m:r>
             </m:oMath>
-            <w:r>
-              <w:t xml:space="preserve">​</w:t>
-            </w:r>
           </w:p>
         </w:tc>
         <w:tc>
@@ -12288,9 +12006,6 @@
                 <m:t>0</m:t>
               </m:r>
             </m:oMath>
-            <w:r>
-              <w:t xml:space="preserve">​</w:t>
-            </w:r>
           </w:p>
         </w:tc>
         <w:tc>
@@ -12310,9 +12025,6 @@
                 <m:t>%</m:t>
               </m:r>
             </m:oMath>
-            <w:r>
-              <w:t xml:space="preserve">​</w:t>
-            </w:r>
           </w:p>
         </w:tc>
         <w:tc>
@@ -12326,9 +12038,6 @@
                 <m:t>2.8</m:t>
               </m:r>
             </m:oMath>
-            <w:r>
-              <w:t xml:space="preserve">​</w:t>
-            </w:r>
           </w:p>
         </w:tc>
       </w:tr>
@@ -12659,9 +12368,6 @@
                 </m:sub>
               </m:sSub>
             </m:oMath>
-            <w:r>
-              <w:t xml:space="preserve">​</w:t>
-            </w:r>
           </w:p>
         </w:tc>
         <w:tc>
@@ -12675,9 +12381,6 @@
                 <m:t>25</m:t>
               </m:r>
             </m:oMath>
-            <w:r>
-              <w:t xml:space="preserve">​</w:t>
-            </w:r>
           </w:p>
         </w:tc>
         <w:tc>
@@ -12697,9 +12400,6 @@
                 <m:t>%</m:t>
               </m:r>
             </m:oMath>
-            <w:r>
-              <w:t xml:space="preserve">​</w:t>
-            </w:r>
           </w:p>
         </w:tc>
         <w:tc>
@@ -12713,9 +12413,6 @@
                 <m:t>37.6</m:t>
               </m:r>
             </m:oMath>
-            <w:r>
-              <w:t xml:space="preserve">​</w:t>
-            </w:r>
           </w:p>
         </w:tc>
       </w:tr>
@@ -12740,9 +12437,6 @@
                 </m:sub>
               </m:sSub>
             </m:oMath>
-            <w:r>
-              <w:t xml:space="preserve">​</w:t>
-            </w:r>
           </w:p>
         </w:tc>
         <w:tc>
@@ -12756,9 +12450,6 @@
                 <m:t>25</m:t>
               </m:r>
             </m:oMath>
-            <w:r>
-              <w:t xml:space="preserve">​</w:t>
-            </w:r>
           </w:p>
         </w:tc>
         <w:tc>
@@ -12778,9 +12469,6 @@
                 <m:t>%</m:t>
               </m:r>
             </m:oMath>
-            <w:r>
-              <w:t xml:space="preserve">​</w:t>
-            </w:r>
           </w:p>
         </w:tc>
         <w:tc>
@@ -12794,9 +12482,6 @@
                 <m:t>41.8</m:t>
               </m:r>
             </m:oMath>
-            <w:r>
-              <w:t xml:space="preserve">​</w:t>
-            </w:r>
           </w:p>
         </w:tc>
       </w:tr>
@@ -12821,9 +12506,6 @@
                 </m:sub>
               </m:sSub>
             </m:oMath>
-            <w:r>
-              <w:t xml:space="preserve">​</w:t>
-            </w:r>
           </w:p>
         </w:tc>
         <w:tc>
@@ -12837,9 +12519,6 @@
                 <m:t>25</m:t>
               </m:r>
             </m:oMath>
-            <w:r>
-              <w:t xml:space="preserve">​</w:t>
-            </w:r>
           </w:p>
         </w:tc>
         <w:tc>
@@ -12859,9 +12538,6 @@
                 <m:t>%</m:t>
               </m:r>
             </m:oMath>
-            <w:r>
-              <w:t xml:space="preserve">​</w:t>
-            </w:r>
           </w:p>
         </w:tc>
         <w:tc>
@@ -12875,9 +12551,6 @@
                 <m:t>49.6</m:t>
               </m:r>
             </m:oMath>
-            <w:r>
-              <w:t xml:space="preserve">​</w:t>
-            </w:r>
           </w:p>
         </w:tc>
       </w:tr>
@@ -12902,9 +12575,6 @@
                 </m:sub>
               </m:sSub>
             </m:oMath>
-            <w:r>
-              <w:t xml:space="preserve">​</w:t>
-            </w:r>
           </w:p>
         </w:tc>
         <w:tc>
@@ -12918,9 +12588,6 @@
                 <m:t>25</m:t>
               </m:r>
             </m:oMath>
-            <w:r>
-              <w:t xml:space="preserve">​</w:t>
-            </w:r>
           </w:p>
         </w:tc>
         <w:tc>
@@ -12940,9 +12607,6 @@
                 <m:t>%</m:t>
               </m:r>
             </m:oMath>
-            <w:r>
-              <w:t xml:space="preserve">​</w:t>
-            </w:r>
           </w:p>
         </w:tc>
         <w:tc>
@@ -12956,9 +12620,6 @@
                 <m:t>60.0</m:t>
               </m:r>
             </m:oMath>
-            <w:r>
-              <w:t xml:space="preserve">​</w:t>
-            </w:r>
           </w:p>
         </w:tc>
       </w:tr>
@@ -12983,9 +12644,6 @@
                 </m:sub>
               </m:sSub>
             </m:oMath>
-            <w:r>
-              <w:t xml:space="preserve">​</w:t>
-            </w:r>
           </w:p>
         </w:tc>
         <w:tc>
@@ -12999,9 +12657,6 @@
                 <m:t>25</m:t>
               </m:r>
             </m:oMath>
-            <w:r>
-              <w:t xml:space="preserve">​</w:t>
-            </w:r>
           </w:p>
         </w:tc>
         <w:tc>
@@ -13021,9 +12676,6 @@
                 <m:t>%</m:t>
               </m:r>
             </m:oMath>
-            <w:r>
-              <w:t xml:space="preserve">​</w:t>
-            </w:r>
           </w:p>
         </w:tc>
         <w:tc>
@@ -13037,9 +12689,6 @@
                 <m:t>65.3</m:t>
               </m:r>
             </m:oMath>
-            <w:r>
-              <w:t xml:space="preserve">​</w:t>
-            </w:r>
           </w:p>
         </w:tc>
       </w:tr>
@@ -13082,7 +12731,7 @@
         <w:pStyle w:val="FirstParagraph"/>
       </w:pPr>
       <w:r>
-        <w:t xml:space="preserve">Addressing Q3, the two</w:t>
+        <w:t xml:space="preserve">The two</w:t>
       </w:r>
       <w:r>
         <w:t xml:space="preserve"> </w:t>
@@ -13105,7 +12754,7 @@
         <w:t xml:space="preserve"> </w:t>
       </w:r>
       <w:r>
-        <w:t xml:space="preserve">levels carry related but largely distinct information. Over</w:t>
+        <w:t xml:space="preserve">levels carry distinct rather than redundant information. Over</w:t>
       </w:r>
       <w:r>
         <w:t xml:space="preserve"> </w:t>
@@ -13577,9 +13226,6 @@
                 <m:t>280</m:t>
               </m:r>
             </m:oMath>
-            <w:r>
-              <w:t xml:space="preserve">​</w:t>
-            </w:r>
           </w:p>
         </w:tc>
         <w:tc>
@@ -13602,9 +13248,6 @@
                 <m:t>167</m:t>
               </m:r>
             </m:oMath>
-            <w:r>
-              <w:t xml:space="preserve">​</w:t>
-            </w:r>
           </w:p>
         </w:tc>
       </w:tr>
@@ -13654,9 +13297,6 @@
                 <m:t>2</m:t>
               </m:r>
             </m:oMath>
-            <w:r>
-              <w:t xml:space="preserve">​</w:t>
-            </w:r>
           </w:p>
         </w:tc>
         <w:tc>
@@ -13670,9 +13310,6 @@
                 <m:t>51</m:t>
               </m:r>
             </m:oMath>
-            <w:r>
-              <w:t xml:space="preserve">​</w:t>
-            </w:r>
           </w:p>
         </w:tc>
       </w:tr>
@@ -13682,7 +13319,7 @@
         <w:pStyle w:val="BodyText"/>
       </w:pPr>
       <w:r>
-        <w:t xml:space="preserve">A TDA-native check agrees. Bottleneck distance between the two levels’ diagrams has median</w:t>
+        <w:t xml:space="preserve">Bottleneck distance between the two levels’ diagrams has median</w:t>
       </w:r>
       <w:r>
         <w:t xml:space="preserve"> </w:t>
@@ -13721,7 +13358,7 @@
         <w:t xml:space="preserve"> </w:t>
       </w:r>
       <w:r>
-        <w:t xml:space="preserve">m. That is on the order of typical tactical loop size on the primary match (</w:t>
+        <w:t xml:space="preserve">m. That is on the order of typical tactical filtration lifetime on the primary match (</w:t>
       </w:r>
       <m:oMath>
         <m:r>
@@ -13732,7 +13369,7 @@
         <w:t xml:space="preserve"> </w:t>
       </w:r>
       <w:r>
-        <w:t xml:space="preserve">m mean filtration lifetime where loops appear; Table 1). Landscape</w:t>
+        <w:t xml:space="preserve">m mean bar length where loops appear; Table 1). Landscape</w:t>
       </w:r>
       <w:r>
         <w:t xml:space="preserve"> </w:t>
@@ -13784,7 +13421,7 @@
         <w:pStyle w:val="FirstParagraph"/>
       </w:pPr>
       <w:r>
-        <w:t xml:space="preserve">Addressing Q4, total persistence moves with on-ball match events. This is a construct-validity check against measurement noise, not a football analysis. The comparison uses SkillCorner annotations (</w:t>
+        <w:t xml:space="preserve">Total persistence moves with on-ball match events. This is a construct-validity check against measurement noise, not a football analysis. The comparison uses SkillCorner annotations (</w:t>
       </w:r>
       <m:oMath>
         <m:r>
@@ -14053,7 +13690,7 @@
         <w:pStyle w:val="FirstParagraph"/>
       </w:pPr>
       <w:r>
-        <w:t xml:space="preserve">Addressing Q1, the three</w:t>
+        <w:t xml:space="preserve">The three</w:t>
       </w:r>
       <w:r>
         <w:t xml:space="preserve"> </w:t>
@@ -14076,7 +13713,29 @@
         <w:t xml:space="preserve"> </w:t>
       </w:r>
       <w:r>
-        <w:t xml:space="preserve">regimes (individual, tactical, and team) are the cardinality targets of Section 2.3, read from the pooled</w:t>
+        <w:t xml:space="preserve">regimes (individual, tactical, and team) are the named group-count targets of Section 2.3, read from the pooled group-count curve on every complete frame of the ten matches (Figure 2). Those regimes remain over a range of</w:t>
+      </w:r>
+      <w:r>
+        <w:t xml:space="preserve"> </w:t>
+      </w:r>
+      <m:oMath>
+        <m:r>
+          <m:t>δ</m:t>
+        </m:r>
+      </m:oMath>
+      <w:r>
+        <w:t xml:space="preserve"> </w:t>
+      </w:r>
+      <w:r>
+        <w:t xml:space="preserve">rather than appearing only at the adopted cutoffs. The metre values are specific to this corpus. Another domain still requires the interaction lengths to be re-derived.</w:t>
+      </w:r>
+    </w:p>
+    <w:p>
+      <w:pPr>
+        <w:pStyle w:val="BodyText"/>
+      </w:pPr>
+      <w:r>
+        <w:t xml:space="preserve">The tactical cutoff is the inversion of a named group count (mean</w:t>
       </w:r>
       <w:r>
         <w:t xml:space="preserve"> </w:t>
@@ -14094,49 +13753,82 @@
             </m:r>
           </m:sub>
         </m:sSub>
-        <m:r>
-          <m:rPr>
-            <m:sty m:val="p"/>
-          </m:rPr>
-          <m:t>(</m:t>
-        </m:r>
-        <m:r>
-          <m:t>δ</m:t>
-        </m:r>
-        <m:r>
-          <m:rPr>
-            <m:sty m:val="p"/>
-          </m:rPr>
-          <m:t>)</m:t>
-        </m:r>
-      </m:oMath>
-      <w:r>
-        <w:t xml:space="preserve"> </w:t>
-      </w:r>
-      <w:r>
-        <w:t xml:space="preserve">curve on every complete frame of the ten matches (Figure 2). Those regimes remain over a range of</w:t>
-      </w:r>
-      <w:r>
-        <w:t xml:space="preserve"> </w:t>
-      </w:r>
-      <m:oMath>
-        <m:r>
-          <m:t>δ</m:t>
-        </m:r>
-      </m:oMath>
-      <w:r>
-        <w:t xml:space="preserve"> </w:t>
-      </w:r>
-      <w:r>
-        <w:t xml:space="preserve">rather than appearing only at the adopted cutoffs. Application to another bounded competitive system still requires the interaction lengths to be re-derived on that domain.</w:t>
-      </w:r>
-    </w:p>
-    <w:p>
-      <w:pPr>
-        <w:pStyle w:val="BodyText"/>
-      </w:pPr>
-      <w:r>
-        <w:t xml:space="preserve">The tactical cutoff is the inversion of a named cardinality (mean</w:t>
+      </m:oMath>
+      <w:r>
+        <w:t xml:space="preserve"> </w:t>
+      </w:r>
+      <w:r>
+        <w:t xml:space="preserve">nearest 5, with</w:t>
+      </w:r>
+      <w:r>
+        <w:t xml:space="preserve"> </w:t>
+      </w:r>
+      <m:oMath>
+        <m:r>
+          <m:t>k</m:t>
+        </m:r>
+        <m:r>
+          <m:rPr>
+            <m:sty m:val="p"/>
+          </m:rPr>
+          <m:t>≥</m:t>
+        </m:r>
+        <m:r>
+          <m:t>4</m:t>
+        </m:r>
+      </m:oMath>
+      <w:r>
+        <w:t xml:space="preserve"> </w:t>
+      </w:r>
+      <w:r>
+        <w:t xml:space="preserve">still common; Figure 2c). On the 1 Hz diagnostic subset the only interior silhouette local maximum is at</w:t>
+      </w:r>
+      <w:r>
+        <w:t xml:space="preserve"> </w:t>
+      </w:r>
+      <m:oMath>
+        <m:r>
+          <m:t>7.0</m:t>
+        </m:r>
+      </m:oMath>
+      <w:r>
+        <w:t xml:space="preserve"> </w:t>
+      </w:r>
+      <w:r>
+        <w:t xml:space="preserve">m, a small-group alternative that keeps rising into the two-envelope regime once frames that collapse to</w:t>
+      </w:r>
+      <w:r>
+        <w:t xml:space="preserve"> </w:t>
+      </w:r>
+      <m:oMath>
+        <m:r>
+          <m:t>k</m:t>
+        </m:r>
+        <m:r>
+          <m:rPr>
+            <m:sty m:val="p"/>
+          </m:rPr>
+          <m:t>=</m:t>
+        </m:r>
+        <m:r>
+          <m:t>1</m:t>
+        </m:r>
+      </m:oMath>
+      <w:r>
+        <w:t xml:space="preserve"> </w:t>
+      </w:r>
+      <w:r>
+        <w:t xml:space="preserve">are dropped (Supplementary Figure S2). Those features are reported, not adopted.</w:t>
+      </w:r>
+    </w:p>
+    <w:bookmarkEnd w:id="30"/>
+    <w:bookmarkStart w:id="31" w:name="two-h_1-regimes"/>
+    <w:p>
+      <w:pPr>
+        <w:pStyle w:val="Heading3"/>
+      </w:pPr>
+      <w:r>
+        <w:t xml:space="preserve">4.2 Two</w:t>
       </w:r>
       <w:r>
         <w:t xml:space="preserve"> </w:t>
@@ -14150,7 +13842,7 @@
           </m:e>
           <m:sub>
             <m:r>
-              <m:t>0</m:t>
+              <m:t>1</m:t>
             </m:r>
           </m:sub>
         </m:sSub>
@@ -14159,77 +13851,23 @@
         <w:t xml:space="preserve"> </w:t>
       </w:r>
       <w:r>
-        <w:t xml:space="preserve">nearest 5, with</w:t>
-      </w:r>
-      <w:r>
-        <w:t xml:space="preserve"> </w:t>
-      </w:r>
-      <m:oMath>
-        <m:r>
-          <m:t>k</m:t>
-        </m:r>
-        <m:r>
-          <m:rPr>
-            <m:sty m:val="p"/>
-          </m:rPr>
-          <m:t>≥</m:t>
-        </m:r>
-        <m:r>
-          <m:t>4</m:t>
-        </m:r>
-      </m:oMath>
-      <w:r>
-        <w:t xml:space="preserve"> </w:t>
-      </w:r>
-      <w:r>
-        <w:t xml:space="preserve">still common; Figure 2c). On the 1 Hz diagnostic subset the only interior silhouette local maximum is at</w:t>
-      </w:r>
-      <w:r>
-        <w:t xml:space="preserve"> </w:t>
-      </w:r>
-      <m:oMath>
-        <m:r>
-          <m:t>7.0</m:t>
-        </m:r>
-      </m:oMath>
-      <w:r>
-        <w:t xml:space="preserve"> </w:t>
-      </w:r>
-      <w:r>
-        <w:t xml:space="preserve">m, a small-group alternative that keeps rising into the two-envelope regime once frames that collapse to</w:t>
-      </w:r>
-      <w:r>
-        <w:t xml:space="preserve"> </w:t>
-      </w:r>
-      <m:oMath>
-        <m:r>
-          <m:t>k</m:t>
-        </m:r>
-        <m:r>
-          <m:rPr>
-            <m:sty m:val="p"/>
-          </m:rPr>
-          <m:t>=</m:t>
-        </m:r>
-        <m:r>
-          <m:t>1</m:t>
-        </m:r>
-      </m:oMath>
-      <w:r>
-        <w:t xml:space="preserve"> </w:t>
-      </w:r>
-      <w:r>
-        <w:t xml:space="preserve">are dropped (Supplementary Figure S2). Those features are reported, not adopted.</w:t>
-      </w:r>
-    </w:p>
-    <w:bookmarkEnd w:id="30"/>
-    <w:bookmarkStart w:id="31" w:name="two-h_1-regimes"/>
-    <w:p>
-      <w:pPr>
-        <w:pStyle w:val="Heading3"/>
-      </w:pPr>
-      <w:r>
-        <w:t xml:space="preserve">4.2 Two</w:t>
+        <w:t xml:space="preserve">regimes</w:t>
+      </w:r>
+    </w:p>
+    <w:p>
+      <w:pPr>
+        <w:pStyle w:val="FirstParagraph"/>
+      </w:pPr>
+      <w:r>
+        <w:t xml:space="preserve">Scale-attributable homology detects loops at two of the three recovered levels. Individual-level loops are frequent; tactical-level loops are rarer and have longer filtration lifetime (Tables 1–2; Figure 4). Filtration lifetime is the bar length (death minus birth, in metres). It is not how long a loop lasts on the clock. The 150-frame subsample does not resolve formation or dispersion of loops between samples (Section 2.1).</w:t>
+      </w:r>
+    </w:p>
+    <w:p>
+      <w:pPr>
+        <w:pStyle w:val="BodyText"/>
+      </w:pPr>
+      <w:r>
+        <w:t xml:space="preserve">Every examined</w:t>
       </w:r>
       <w:r>
         <w:t xml:space="preserve"> </w:t>
@@ -14252,23 +13890,7 @@
         <w:t xml:space="preserve"> </w:t>
       </w:r>
       <w:r>
-        <w:t xml:space="preserve">regimes</w:t>
-      </w:r>
-    </w:p>
-    <w:p>
-      <w:pPr>
-        <w:pStyle w:val="FirstParagraph"/>
-      </w:pPr>
-      <w:r>
-        <w:t xml:space="preserve">Addressing Q2, scale-attributable homology detects loops at two of the three recovered levels. Individual-level loops are frequent; tactical-level loops are rarer and have longer filtration lifetime (Tables 1–2; Figure 4). Filtration lifetime is the bar length (death minus birth, in metres). It is not how long a loop lasts on the clock. The 150-frame subsample does not resolve formation or dispersion of loops between samples (Section 2.1).</w:t>
-      </w:r>
-    </w:p>
-    <w:p>
-      <w:pPr>
-        <w:pStyle w:val="BodyText"/>
-      </w:pPr>
-      <w:r>
-        <w:t xml:space="preserve">Every examined</w:t>
+        <w:t xml:space="preserve">feature is realised as a loop in space (Figure 3). Detection is not confined to the adopted cutoff or to a single truncation percentile (Section 3.4). Tactical</w:t>
       </w:r>
       <w:r>
         <w:t xml:space="preserve"> </w:t>
@@ -14291,7 +13913,7 @@
         <w:t xml:space="preserve"> </w:t>
       </w:r>
       <w:r>
-        <w:t xml:space="preserve">feature is realised as a loop in space (Figure 3). Detection is not confined to the adopted cutoff or to a single truncation percentile (Section 3.4). The operative tactical setting occupies the band</w:t>
+        <w:t xml:space="preserve">is detected on the band</w:t>
       </w:r>
       <w:r>
         <w:t xml:space="preserve"> </w:t>
@@ -14326,7 +13948,7 @@
         <w:t xml:space="preserve"> </w:t>
       </w:r>
       <w:r>
-        <w:t xml:space="preserve">m, not an isolated optimum.</w:t>
+        <w:t xml:space="preserve">m, not only at an isolated optimum.</w:t>
       </w:r>
     </w:p>
     <w:p>
@@ -14380,7 +14002,7 @@
         <w:t xml:space="preserve"> </w:t>
       </w:r>
       <w:r>
-        <w:t xml:space="preserve">regimes. At the team level the reduced cloud almost never has enough centroids to close a loop (see the team-level Remark in Section 3.2). Recovering team-level loop structure on the typical envelope would require a different representation, such as spatial density fields or Delaunay triangulations. Linkage choice changes tactical</w:t>
+        <w:t xml:space="preserve">regimes. At the team level the reduced cloud almost never has enough groups to close a loop (see the team-level Remark in Section 3.2). Recovering team-level loop structure on the typical envelope would require a different representation, such as spatial density fields or Delaunay triangulations. Linkage choice changes tactical</w:t>
       </w:r>
       <w:r>
         <w:t xml:space="preserve"> </w:t>
@@ -14421,7 +14043,30 @@
         <w:pStyle w:val="FirstParagraph"/>
       </w:pPr>
       <w:r>
-        <w:t xml:space="preserve">Addressing Q3, the two levels are not measuring the same structure at different resolutions. If the tactical signal were a coarsened version of the individual signal, the two would co-occur far more consistently than Table 7 shows. The bottleneck and landscape distances would also be small relative to each level’s own filtration lifetimes (Section 3.5). Clustering before persistent homology is therefore not a convenience for separating noise. It produces two informationally distinct objects.</w:t>
+        <w:t xml:space="preserve">The two</w:t>
+      </w:r>
+      <w:r>
+        <w:t xml:space="preserve"> </w:t>
+      </w:r>
+      <m:oMath>
+        <m:sSub>
+          <m:e>
+            <m:r>
+              <m:t>H</m:t>
+            </m:r>
+          </m:e>
+          <m:sub>
+            <m:r>
+              <m:t>1</m:t>
+            </m:r>
+          </m:sub>
+        </m:sSub>
+      </m:oMath>
+      <w:r>
+        <w:t xml:space="preserve"> </w:t>
+      </w:r>
+      <w:r>
+        <w:t xml:space="preserve">levels carry distinct rather than redundant information. They are not measuring the same structure at different resolutions. If the tactical signal were a coarsened version of the individual signal, the two would co-occur far more consistently than Table 7 shows. The bottleneck and landscape distances would also be small relative to each level’s own filtration lifetimes (Section 3.5). Clustering before persistent homology is therefore not a convenience for separating noise. It produces two informationally distinct objects.</w:t>
       </w:r>
     </w:p>
     <w:bookmarkEnd w:id="32"/>
@@ -14439,7 +14084,7 @@
         <w:pStyle w:val="FirstParagraph"/>
       </w:pPr>
       <w:r>
-        <w:t xml:space="preserve">Addressing Q4, the preliminary answer is yes: total persistence is not independent of on-ball events. At the individual level, mean</w:t>
+        <w:t xml:space="preserve">Total persistence is not independent of on-ball events, as a preliminary construct-validity check. At the individual level, mean</w:t>
       </w:r>
       <w:r>
         <w:t xml:space="preserve"> </w:t>
@@ -14496,7 +14141,7 @@
         <w:t xml:space="preserve"> </w:t>
       </w:r>
       <w:r>
-        <w:t xml:space="preserve">m after build-up (Section 3.6). That is a construct-validity check only. Multiple-testing control and football interpretation belong to a companion manuscript (Paper B).</w:t>
+        <w:t xml:space="preserve">m after build-up (Section 3.6). Multiple-testing control and football interpretation belong to a companion manuscript (Paper B).</w:t>
       </w:r>
     </w:p>
     <w:bookmarkEnd w:id="33"/>
@@ -14638,7 +14283,7 @@
         <w:t xml:space="preserve"> </w:t>
       </w:r>
       <w:r>
-        <w:t xml:space="preserve">total-persistence sequence. Operationalising this would require three things. First, choose the dynamical state. Second, defend the sparsity of the recovered library against AIC, BIC, or cross-validation baselines. Third, confirm that the resulting persistence sequence is genuinely lower-dimensional under the selected linkage. We defer this to the forthcoming full-season work. A population-sized sample of match sequences is what makes the sparsity comparison meaningful.</w:t>
+        <w:t xml:space="preserve">total-persistence sequence. Operationalising this would require three things. First, choose the dynamical state. Second, defend the sparsity of the recovered library against the Akaike information criterion (AIC), the Bayesian information criterion (BIC), or cross-validation baselines. Third, confirm that the resulting persistence sequence is genuinely lower-dimensional under the selected linkage. We defer this to the forthcoming full-season work. A population-sized sample of match sequences is what makes the sparsity comparison meaningful.</w:t>
       </w:r>
     </w:p>
     <w:p>
@@ -14646,7 +14291,53 @@
         <w:pStyle w:val="BodyText"/>
       </w:pPr>
       <w:r>
-        <w:t xml:space="preserve">A landscape-path stability criterion remains a future estimator of the tactical cutoff. We defer it to the persistence-landscape companion work. Section 3.4 reports the operative tactical</w:t>
+        <w:t xml:space="preserve">A landscape-path stability criterion (minimise variation of the persistence landscape under small perturbations of</w:t>
+      </w:r>
+      <w:r>
+        <w:t xml:space="preserve"> </w:t>
+      </w:r>
+      <m:oMath>
+        <m:r>
+          <m:t>δ</m:t>
+        </m:r>
+      </m:oMath>
+      <w:r>
+        <w:t xml:space="preserve">) remains a future estimator of the tactical cutoff. It is computable with the landscape infrastructure of Section 3.5. We defer it to the persistence-landscape companion work. Section 3.4 reports the</w:t>
+      </w:r>
+      <w:r>
+        <w:t xml:space="preserve"> </w:t>
+      </w:r>
+      <m:oMath>
+        <m:r>
+          <m:rPr>
+            <m:sty m:val="p"/>
+          </m:rPr>
+          <m:t>[</m:t>
+        </m:r>
+        <m:r>
+          <m:t>6</m:t>
+        </m:r>
+        <m:r>
+          <m:rPr>
+            <m:sty m:val="p"/>
+          </m:rPr>
+          <m:t>,</m:t>
+        </m:r>
+        <m:r>
+          <m:t>14</m:t>
+        </m:r>
+        <m:r>
+          <m:rPr>
+            <m:sty m:val="p"/>
+          </m:rPr>
+          <m:t>]</m:t>
+        </m:r>
+      </m:oMath>
+      <w:r>
+        <w:t xml:space="preserve"> </w:t>
+      </w:r>
+      <w:r>
+        <w:t xml:space="preserve">m tactical</w:t>
       </w:r>
       <w:r>
         <w:t xml:space="preserve"> </w:t>
@@ -14669,7 +14360,7 @@
         <w:t xml:space="preserve"> </w:t>
       </w:r>
       <w:r>
-        <w:t xml:space="preserve">range as an empirical property around the adopted</w:t>
+        <w:t xml:space="preserve">band as an empirical property around the adopted</w:t>
       </w:r>
       <w:r>
         <w:t xml:space="preserve"> </w:t>
@@ -14815,7 +14506,7 @@
         <w:t xml:space="preserve"> </w:t>
       </w:r>
       <w:r>
-        <w:t xml:space="preserve">counts, filtration lifetimes, and landscape norms, and will test tactical-fingerprint classification at population scale. It is also the setting in which the linkage criterion proposed above becomes evaluable. Recovering a sparse governing equation for a persistence functional requires the population-sized sample of match sequences that a single season provides. Separately, persistence landscape dynamics are being developed to treat each match as a path through landscape space. That is the setting in which the landscape-stability cutoff criterion can itself be evaluated. Its resampling unit is the match-level landscape, not the per-frame summary used here.</w:t>
+        <w:t xml:space="preserve">counts, filtration lifetimes, and landscape norms, and will test whether matches carry a stable tactical signature at population scale. It is also the setting in which the linkage criterion proposed above becomes evaluable. Recovering a sparse governing equation for a persistence functional requires the population-sized sample of match sequences that a single season provides. Separately, persistence landscape dynamics are being developed to treat each match as a path through landscape space. That is the setting in which the landscape-stability cutoff criterion can itself be evaluated. Its resampling unit is the match-level landscape, not the per-frame summary used here.</w:t>
       </w:r>
     </w:p>
     <w:p>
@@ -14841,7 +14532,7 @@
         <w:pStyle w:val="FirstParagraph"/>
       </w:pPr>
       <w:r>
-        <w:t xml:space="preserve">On ten professional football matches, clustering at recovered interaction lengths and a truncation of the Vietoris–Rips parameter produced three stable</w:t>
+        <w:t xml:space="preserve">On ten professional football matches, clustering at recovered interaction lengths and a truncation of the Vietoris–Rips parameter produced three</w:t>
       </w:r>
       <w:r>
         <w:t xml:space="preserve"> </w:t>
@@ -14933,7 +14624,7 @@
         <w:t xml:space="preserve"> </w:t>
       </w:r>
       <w:r>
-        <w:t xml:space="preserve">levels carry distinct rather than redundant information. Those findings answer whether persistent homology can be made scale-attributable on a competitive collective system. Scale conflation is the underlying TDA fact: a single filtration on a hierarchically organised point cloud mixes organisational levels. Football was the measurement setting. The same pipeline applies to other bounded competitive systems once interaction lengths are re-derived.</w:t>
+        <w:t xml:space="preserve">levels carry distinct rather than redundant information. Those findings answer whether persistent homology can be made scale-attributable on a competitive collective system: each diagram belonging to one organisational level. Football was the measurement setting. The same pipeline applies to other bounded competitive systems once interaction lengths are re-derived.</w:t>
       </w:r>
     </w:p>
     <w:p>
@@ -14944,7 +14635,7 @@
       </w:r>
     </w:p>
     <w:bookmarkEnd w:id="37"/>
-    <w:bookmarkStart w:id="43" w:name="declarations"/>
+    <w:bookmarkStart w:id="44" w:name="declarations"/>
     <w:p>
       <w:pPr>
         <w:pStyle w:val="Heading2"/>
@@ -14967,16 +14658,34 @@
         <w:pStyle w:val="FirstParagraph"/>
       </w:pPr>
       <w:r>
-        <w:t xml:space="preserve">The authors have no relevant financial or non-financial interests to disclose.</w:t>
+        <w:t xml:space="preserve">The authors have no competing interests to declare.</w:t>
       </w:r>
     </w:p>
     <w:bookmarkEnd w:id="38"/>
-    <w:bookmarkStart w:id="39" w:name="funding"/>
+    <w:bookmarkStart w:id="39" w:name="acknowledgements"/>
     <w:p>
       <w:pPr>
         <w:pStyle w:val="Heading3"/>
       </w:pPr>
       <w:r>
+        <w:t xml:space="preserve">Acknowledgements</w:t>
+      </w:r>
+    </w:p>
+    <w:p>
+      <w:pPr>
+        <w:pStyle w:val="FirstParagraph"/>
+      </w:pPr>
+      <w:r>
+        <w:t xml:space="preserve">The authors thank SkillCorner for use of the open broadcast tracking dataset.</w:t>
+      </w:r>
+    </w:p>
+    <w:bookmarkEnd w:id="39"/>
+    <w:bookmarkStart w:id="40" w:name="funding"/>
+    <w:p>
+      <w:pPr>
+        <w:pStyle w:val="Heading3"/>
+      </w:pPr>
+      <w:r>
         <w:t xml:space="preserve">Funding</w:t>
       </w:r>
     </w:p>
@@ -14988,8 +14697,8 @@
         <w:t xml:space="preserve">This research received no specific grant from any funding agency in the public, commercial, or not-for-profit sectors; it was conceived and conducted independently by the authors.</w:t>
       </w:r>
     </w:p>
-    <w:bookmarkEnd w:id="39"/>
-    <w:bookmarkStart w:id="41" w:name="data-availability-statement"/>
+    <w:bookmarkEnd w:id="40"/>
+    <w:bookmarkStart w:id="42" w:name="data-availability-statement"/>
     <w:p>
       <w:pPr>
         <w:pStyle w:val="Heading3"/>
@@ -15005,7 +14714,7 @@
       <w:r>
         <w:t xml:space="preserve">Positional tracking data were provided by SkillCorner under an open-data licence (</w:t>
       </w:r>
-      <w:hyperlink r:id="rId40">
+      <w:hyperlink r:id="rId41">
         <w:r>
           <w:rPr>
             <w:rStyle w:val="Hyperlink"/>
@@ -15029,8 +14738,8 @@
         <w:t xml:space="preserve">, and the result files used for the figures and tables in this paper are included with the manuscript materials and will be released in a dedicated public repository at arXiv posting, deposited in the Swansea University Zenodo community.</w:t>
       </w:r>
     </w:p>
-    <w:bookmarkEnd w:id="41"/>
-    <w:bookmarkStart w:id="42" w:name="use-of-large-language-models"/>
+    <w:bookmarkEnd w:id="42"/>
+    <w:bookmarkStart w:id="43" w:name="use-of-large-language-models"/>
     <w:p>
       <w:pPr>
         <w:pStyle w:val="Heading3"/>
@@ -15054,9 +14763,9 @@
         </w:pict>
       </w:r>
     </w:p>
-    <w:bookmarkEnd w:id="42"/>
     <w:bookmarkEnd w:id="43"/>
-    <w:bookmarkStart w:id="45" w:name="references-compact"/>
+    <w:bookmarkEnd w:id="44"/>
+    <w:bookmarkStart w:id="46" w:name="references-compact"/>
     <w:p>
       <w:pPr>
         <w:pStyle w:val="Heading2"/>
@@ -15436,7 +15145,7 @@
       <w:r>
         <w:t xml:space="preserve"> </w:t>
       </w:r>
-      <w:hyperlink r:id="rId40">
+      <w:hyperlink r:id="rId41">
         <w:r>
           <w:rPr>
             <w:rStyle w:val="Hyperlink"/>
@@ -15484,7 +15193,7 @@
       <w:r>
         <w:t xml:space="preserve"> </w:t>
       </w:r>
-      <w:hyperlink r:id="rId44">
+      <w:hyperlink r:id="rId45">
         <w:r>
           <w:rPr>
             <w:rStyle w:val="Hyperlink"/>
@@ -15608,8 +15317,8 @@
         </w:pict>
       </w:r>
     </w:p>
-    <w:bookmarkEnd w:id="45"/>
-    <w:bookmarkStart w:id="49" w:name="supplement"/>
+    <w:bookmarkEnd w:id="46"/>
+    <w:bookmarkStart w:id="50" w:name="supplement"/>
     <w:p>
       <w:pPr>
         <w:pStyle w:val="Heading2"/>
@@ -15618,7 +15327,7 @@
         <w:t xml:space="preserve">Supplement</w:t>
       </w:r>
     </w:p>
-    <w:bookmarkStart w:id="46" w:name="table-s1.-skillcorner-match-identifiers"/>
+    <w:bookmarkStart w:id="47" w:name="table-s1.-skillcorner-match-identifiers"/>
     <w:p>
       <w:pPr>
         <w:pStyle w:val="Heading3"/>
@@ -15731,9 +15440,6 @@
                 <m:t>1886347</m:t>
               </m:r>
             </m:oMath>
-            <w:r>
-              <w:t xml:space="preserve">​</w:t>
-            </w:r>
           </w:p>
         </w:tc>
         <w:tc>
@@ -15782,9 +15488,6 @@
                 <m:t>1899585</m:t>
               </m:r>
             </m:oMath>
-            <w:r>
-              <w:t xml:space="preserve">​</w:t>
-            </w:r>
           </w:p>
         </w:tc>
         <w:tc>
@@ -15833,9 +15536,6 @@
                 <m:t>1925299</m:t>
               </m:r>
             </m:oMath>
-            <w:r>
-              <w:t xml:space="preserve">​</w:t>
-            </w:r>
           </w:p>
         </w:tc>
         <w:tc>
@@ -15884,9 +15584,6 @@
                 <m:t>1953632</m:t>
               </m:r>
             </m:oMath>
-            <w:r>
-              <w:t xml:space="preserve">​</w:t>
-            </w:r>
           </w:p>
         </w:tc>
         <w:tc>
@@ -15935,9 +15632,6 @@
                 <m:t>1996435</m:t>
               </m:r>
             </m:oMath>
-            <w:r>
-              <w:t xml:space="preserve">​</w:t>
-            </w:r>
           </w:p>
         </w:tc>
         <w:tc>
@@ -15986,9 +15680,6 @@
                 <m:t>2006229</m:t>
               </m:r>
             </m:oMath>
-            <w:r>
-              <w:t xml:space="preserve">​</w:t>
-            </w:r>
           </w:p>
         </w:tc>
         <w:tc>
@@ -16037,9 +15728,6 @@
                 <m:t>2011166</m:t>
               </m:r>
             </m:oMath>
-            <w:r>
-              <w:t xml:space="preserve">​</w:t>
-            </w:r>
           </w:p>
         </w:tc>
         <w:tc>
@@ -16088,9 +15776,6 @@
                 <m:t>2013725</m:t>
               </m:r>
             </m:oMath>
-            <w:r>
-              <w:t xml:space="preserve">​</w:t>
-            </w:r>
           </w:p>
         </w:tc>
         <w:tc>
@@ -16139,9 +15824,6 @@
                 <m:t>2015213</m:t>
               </m:r>
             </m:oMath>
-            <w:r>
-              <w:t xml:space="preserve">​</w:t>
-            </w:r>
           </w:p>
         </w:tc>
         <w:tc>
@@ -16190,9 +15872,6 @@
                 <m:t>2017461</m:t>
               </m:r>
             </m:oMath>
-            <w:r>
-              <w:t xml:space="preserve">​</w:t>
-            </w:r>
           </w:p>
         </w:tc>
         <w:tc>
@@ -16230,8 +15909,8 @@
         </w:tc>
       </w:tr>
     </w:tbl>
-    <w:bookmarkEnd w:id="46"/>
-    <w:bookmarkStart w:id="47" w:name="clustering-quality-diagnostics"/>
+    <w:bookmarkEnd w:id="47"/>
+    <w:bookmarkStart w:id="48" w:name="clustering-quality-diagnostics"/>
     <w:p>
       <w:pPr>
         <w:pStyle w:val="Heading3"/>
@@ -16245,7 +15924,7 @@
         <w:pStyle w:val="FirstParagraph"/>
       </w:pPr>
       <w:r>
-        <w:t xml:space="preserve">The cutoffs are fixed by cardinality inversion, not by a quality score. For completeness, Supplementary Figure S2 (</w:t>
+        <w:t xml:space="preserve">The cutoffs are read from the group-count curve, not from a quality score. For completeness, Supplementary Figure S2 (</w:t>
       </w:r>
       <w:r>
         <w:rPr>
@@ -16343,8 +16022,8 @@
         <w:t xml:space="preserve">.</w:t>
       </w:r>
     </w:p>
-    <w:bookmarkEnd w:id="47"/>
-    <w:bookmarkStart w:id="48" w:name="temporal-autocorrelation"/>
+    <w:bookmarkEnd w:id="48"/>
+    <w:bookmarkStart w:id="49" w:name="temporal-autocorrelation"/>
     <w:p>
       <w:pPr>
         <w:pStyle w:val="Heading3"/>
@@ -16382,9 +16061,9 @@
         <w:t xml:space="preserve">.</w:t>
       </w:r>
     </w:p>
-    <w:bookmarkEnd w:id="48"/>
     <w:bookmarkEnd w:id="49"/>
     <w:bookmarkEnd w:id="50"/>
+    <w:bookmarkEnd w:id="51"/>
     <w:sectPr>
       <w:footnotePr>
         <w:numRestart w:val="eachSect"/>

</xml_diff>